<commit_message>
made the necessary fixes
</commit_message>
<xml_diff>
--- a/problems/wildfireevacuation/WildfireEvacuation_Editorial_24849627.docx
+++ b/problems/wildfireevacuation/WildfireEvacuation_Editorial_24849627.docx
@@ -8,6 +8,8 @@
         <w:jc w:val="center"/>
         <w:rPr>
           <w:rFonts w:ascii="Times New Roman" w:hAnsi="Times New Roman" w:cs="Times New Roman"/>
+          <w:sz w:val="22"/>
+          <w:szCs w:val="22"/>
           <w:lang w:val="en-MY"/>
         </w:rPr>
       </w:pPr>
@@ -16,6 +18,8 @@
           <w:rFonts w:ascii="Times New Roman" w:hAnsi="Times New Roman" w:cs="Times New Roman"/>
           <w:b/>
           <w:bCs/>
+          <w:sz w:val="22"/>
+          <w:szCs w:val="22"/>
           <w:lang w:val="en-MY"/>
         </w:rPr>
         <w:t>Wildfire Evacuation Problem</w:t>
@@ -28,6 +32,8 @@
           <w:rFonts w:ascii="Times New Roman" w:hAnsi="Times New Roman" w:cs="Times New Roman"/>
           <w:b/>
           <w:bCs/>
+          <w:sz w:val="22"/>
+          <w:szCs w:val="22"/>
           <w:lang w:val="en-MY"/>
         </w:rPr>
       </w:pPr>
@@ -36,6 +42,8 @@
           <w:rFonts w:ascii="Times New Roman" w:hAnsi="Times New Roman" w:cs="Times New Roman"/>
           <w:b/>
           <w:bCs/>
+          <w:sz w:val="22"/>
+          <w:szCs w:val="22"/>
           <w:lang w:val="en-MY"/>
         </w:rPr>
         <w:t>Overview</w:t>
@@ -48,295 +56,62 @@
           <w:rFonts w:ascii="Times New Roman" w:hAnsi="Times New Roman" w:cs="Times New Roman"/>
           <w:sz w:val="22"/>
           <w:szCs w:val="22"/>
-        </w:rPr>
-      </w:pPr>
-      <w:r>
-        <w:rPr>
-          <w:rFonts w:ascii="Times New Roman" w:hAnsi="Times New Roman" w:cs="Times New Roman"/>
-          <w:sz w:val="22"/>
-          <w:szCs w:val="22"/>
-          <w:lang w:val="en-MY"/>
-        </w:rPr>
-        <w:t xml:space="preserve">The problem covers the Max-Flow Algorithm by using a scenario, where a region is threatened by a wildfire, consisting of </w:t>
-      </w:r>
-      <w:r>
-        <w:rPr>
-          <w:rFonts w:ascii="Times New Roman" w:hAnsi="Times New Roman" w:cs="Times New Roman"/>
-          <w:i/>
-          <w:iCs/>
-          <w:sz w:val="22"/>
-          <w:szCs w:val="22"/>
-          <w:lang w:val="en-MY"/>
-        </w:rPr>
-        <w:t>T</w:t>
-      </w:r>
-      <w:r>
-        <w:rPr>
-          <w:rFonts w:ascii="Times New Roman" w:hAnsi="Times New Roman" w:cs="Times New Roman"/>
-          <w:sz w:val="22"/>
-          <w:szCs w:val="22"/>
-          <w:lang w:val="en-MY"/>
-        </w:rPr>
-        <w:t xml:space="preserve"> towns, </w:t>
-      </w:r>
-      <w:r>
-        <w:rPr>
-          <w:rFonts w:ascii="Times New Roman" w:hAnsi="Times New Roman" w:cs="Times New Roman"/>
-          <w:i/>
-          <w:iCs/>
-          <w:sz w:val="22"/>
-          <w:szCs w:val="22"/>
-          <w:lang w:val="en-MY"/>
-        </w:rPr>
-        <w:t>S</w:t>
-      </w:r>
-      <w:r>
-        <w:rPr>
-          <w:rFonts w:ascii="Times New Roman" w:hAnsi="Times New Roman" w:cs="Times New Roman"/>
-          <w:sz w:val="22"/>
-          <w:szCs w:val="22"/>
-          <w:lang w:val="en-MY"/>
-        </w:rPr>
-        <w:t xml:space="preserve"> shelters and </w:t>
-      </w:r>
-      <w:r>
-        <w:rPr>
-          <w:rFonts w:ascii="Times New Roman" w:hAnsi="Times New Roman" w:cs="Times New Roman"/>
-          <w:i/>
-          <w:iCs/>
-          <w:sz w:val="22"/>
-          <w:szCs w:val="22"/>
-          <w:lang w:val="en-MY"/>
-        </w:rPr>
-        <w:t>R</w:t>
-      </w:r>
-      <w:r>
-        <w:rPr>
-          <w:rFonts w:ascii="Times New Roman" w:hAnsi="Times New Roman" w:cs="Times New Roman"/>
-          <w:sz w:val="22"/>
-          <w:szCs w:val="22"/>
-          <w:lang w:val="en-MY"/>
-        </w:rPr>
-        <w:t xml:space="preserve"> roads. Each town </w:t>
-      </w:r>
-      <w:r>
-        <w:rPr>
-          <w:rFonts w:ascii="Times New Roman" w:hAnsi="Times New Roman" w:cs="Times New Roman"/>
-          <w:i/>
-          <w:iCs/>
-          <w:sz w:val="22"/>
-          <w:szCs w:val="22"/>
-          <w:lang w:val="en-MY"/>
-        </w:rPr>
-        <w:t>i</w:t>
-      </w:r>
-      <w:r>
-        <w:rPr>
-          <w:rFonts w:ascii="Times New Roman" w:hAnsi="Times New Roman" w:cs="Times New Roman"/>
-          <w:sz w:val="22"/>
-          <w:szCs w:val="22"/>
-          <w:lang w:val="en-MY"/>
-        </w:rPr>
-        <w:t xml:space="preserve"> has a population of </w:t>
-      </w:r>
-      <w:r>
-        <w:rPr>
-          <w:rFonts w:ascii="Times New Roman" w:hAnsi="Times New Roman" w:cs="Times New Roman"/>
-          <w:i/>
-          <w:iCs/>
-          <w:sz w:val="22"/>
-          <w:szCs w:val="22"/>
-        </w:rPr>
-        <w:t>p</w:t>
-      </w:r>
-      <w:r>
-        <w:rPr>
-          <w:rFonts w:ascii="Times New Roman" w:hAnsi="Times New Roman" w:cs="Times New Roman"/>
-          <w:sz w:val="22"/>
-          <w:szCs w:val="22"/>
-        </w:rPr>
-        <w:t>ᵢ</w:t>
-      </w:r>
-      <w:r>
-        <w:rPr>
-          <w:rFonts w:ascii="Times New Roman" w:hAnsi="Times New Roman" w:cs="Times New Roman"/>
-          <w:sz w:val="22"/>
-          <w:szCs w:val="22"/>
-          <w:lang w:val="en-MY"/>
-        </w:rPr>
-        <w:t xml:space="preserve"> requiring evacuation, each shelter </w:t>
-      </w:r>
-      <w:r>
-        <w:rPr>
-          <w:rFonts w:ascii="Times New Roman" w:hAnsi="Times New Roman" w:cs="Times New Roman"/>
-          <w:i/>
-          <w:iCs/>
-          <w:sz w:val="22"/>
-          <w:szCs w:val="22"/>
-          <w:lang w:val="en-MY"/>
-        </w:rPr>
-        <w:t>j</w:t>
-      </w:r>
-      <w:r>
-        <w:rPr>
-          <w:rFonts w:ascii="Times New Roman" w:hAnsi="Times New Roman" w:cs="Times New Roman"/>
-          <w:sz w:val="22"/>
-          <w:szCs w:val="22"/>
-          <w:lang w:val="en-MY"/>
-        </w:rPr>
-        <w:t xml:space="preserve"> can occupy at most </w:t>
-      </w:r>
-      <w:r>
-        <w:rPr>
-          <w:rFonts w:ascii="Times New Roman" w:hAnsi="Times New Roman" w:cs="Times New Roman"/>
-          <w:i/>
-          <w:iCs/>
-          <w:sz w:val="22"/>
-          <w:szCs w:val="22"/>
-        </w:rPr>
-        <w:t>c</w:t>
-      </w:r>
-      <w:r>
-        <w:rPr>
-          <w:rFonts w:ascii="Times New Roman" w:hAnsi="Times New Roman" w:cs="Times New Roman"/>
-          <w:sz w:val="22"/>
-          <w:szCs w:val="22"/>
-        </w:rPr>
-        <w:t>ⱼ</w:t>
-      </w:r>
-      <w:r>
-        <w:rPr>
-          <w:rFonts w:ascii="Times New Roman" w:hAnsi="Times New Roman" w:cs="Times New Roman"/>
-          <w:sz w:val="22"/>
-          <w:szCs w:val="22"/>
-        </w:rPr>
-        <w:t xml:space="preserve"> people, and each road can carry at most </w:t>
-      </w:r>
-      <w:r>
-        <w:rPr>
-          <w:rFonts w:ascii="Times New Roman" w:hAnsi="Times New Roman" w:cs="Times New Roman"/>
-          <w:i/>
-          <w:iCs/>
-          <w:sz w:val="22"/>
-          <w:szCs w:val="22"/>
-        </w:rPr>
-        <w:t>W</w:t>
-      </w:r>
-      <w:r>
-        <w:rPr>
-          <w:rFonts w:ascii="Times New Roman" w:hAnsi="Times New Roman" w:cs="Times New Roman"/>
-          <w:sz w:val="22"/>
-          <w:szCs w:val="22"/>
-        </w:rPr>
-        <w:t xml:space="preserve"> people. The goal is to identify what is the greatest number of people who can be moved to safety. </w:t>
-      </w:r>
-    </w:p>
-    <w:p>
-      <w:pPr>
-        <w:spacing w:after="0"/>
-        <w:rPr>
-          <w:rFonts w:ascii="Times New Roman" w:hAnsi="Times New Roman" w:cs="Times New Roman"/>
-          <w:sz w:val="22"/>
-          <w:szCs w:val="22"/>
-        </w:rPr>
-      </w:pPr>
-      <w:r>
-        <w:rPr>
-          <w:rFonts w:ascii="Times New Roman" w:hAnsi="Times New Roman" w:cs="Times New Roman"/>
-          <w:sz w:val="22"/>
-          <w:szCs w:val="22"/>
-        </w:rPr>
-        <w:t xml:space="preserve">At first, the problem may appear to require only a comparison of total population against total shelter space. This is not the case as people can only travel on existing roads, and roads have limited capacity, and several towns may for compete for the same road or shelter. Say if one town’s residents are sent to a convenient shelter, another town with fewer options might not be able to reach safety at all. </w:t>
-      </w:r>
-      <w:r>
-        <w:rPr>
-          <w:rFonts w:ascii="Times New Roman" w:hAnsi="Times New Roman" w:cs="Times New Roman"/>
-          <w:sz w:val="22"/>
-          <w:szCs w:val="22"/>
-        </w:rPr>
-        <w:t>Therefore, coordinating the decisions of each town at the same time is a challenge.</w:t>
-      </w:r>
-    </w:p>
-    <w:p>
-      <w:pPr>
-        <w:spacing w:after="0"/>
-        <w:rPr>
-          <w:rFonts w:ascii="Times New Roman" w:hAnsi="Times New Roman" w:cs="Times New Roman"/>
-          <w:sz w:val="22"/>
-          <w:szCs w:val="22"/>
-          <w:lang w:val="en-MY"/>
-        </w:rPr>
-      </w:pPr>
-      <w:r>
-        <w:rPr>
-          <w:rFonts w:ascii="Times New Roman" w:hAnsi="Times New Roman" w:cs="Times New Roman"/>
-          <w:sz w:val="22"/>
-          <w:szCs w:val="22"/>
-        </w:rPr>
-        <w:t xml:space="preserve">The goal is </w:t>
-      </w:r>
-      <w:r>
-        <w:rPr>
-          <w:rFonts w:ascii="Times New Roman" w:hAnsi="Times New Roman" w:cs="Times New Roman"/>
-          <w:sz w:val="22"/>
-          <w:szCs w:val="22"/>
-          <w:lang w:val="en-MY"/>
-        </w:rPr>
-        <w:t>to route as much flow</w:t>
-      </w:r>
-      <w:r>
-        <w:rPr>
-          <w:rFonts w:ascii="Times New Roman" w:hAnsi="Times New Roman" w:cs="Times New Roman"/>
-          <w:sz w:val="22"/>
-          <w:szCs w:val="22"/>
-          <w:lang w:val="en-MY"/>
-        </w:rPr>
-        <w:t xml:space="preserve"> (the people in this case)</w:t>
-      </w:r>
-      <w:r>
-        <w:rPr>
-          <w:rFonts w:ascii="Times New Roman" w:hAnsi="Times New Roman" w:cs="Times New Roman"/>
-          <w:sz w:val="22"/>
-          <w:szCs w:val="22"/>
-          <w:lang w:val="en-MY"/>
-        </w:rPr>
-        <w:t xml:space="preserve"> as possible from where people are (the towns) to where they may be housed (the shelters). The road network is viewed as a directed graph in which </w:t>
-      </w:r>
-      <w:r>
-        <w:rPr>
-          <w:rFonts w:ascii="Times New Roman" w:hAnsi="Times New Roman" w:cs="Times New Roman"/>
-          <w:sz w:val="22"/>
-          <w:szCs w:val="22"/>
-          <w:lang w:val="en-MY"/>
-        </w:rPr>
-        <w:t xml:space="preserve">the </w:t>
-      </w:r>
-      <w:r>
-        <w:rPr>
-          <w:rFonts w:ascii="Times New Roman" w:hAnsi="Times New Roman" w:cs="Times New Roman"/>
-          <w:sz w:val="22"/>
-          <w:szCs w:val="22"/>
-          <w:lang w:val="en-MY"/>
-        </w:rPr>
-        <w:t xml:space="preserve">roads are edges with capacities. The desired solution </w:t>
-      </w:r>
-      <w:r>
-        <w:rPr>
-          <w:rFonts w:ascii="Times New Roman" w:hAnsi="Times New Roman" w:cs="Times New Roman"/>
-          <w:sz w:val="22"/>
-          <w:szCs w:val="22"/>
-          <w:lang w:val="en-MY"/>
-        </w:rPr>
-        <w:t>uses</w:t>
-      </w:r>
-      <w:r>
-        <w:rPr>
-          <w:rFonts w:ascii="Times New Roman" w:hAnsi="Times New Roman" w:cs="Times New Roman"/>
-          <w:sz w:val="22"/>
-          <w:szCs w:val="22"/>
-          <w:lang w:val="en-MY"/>
-        </w:rPr>
-        <w:t xml:space="preserve"> the Edmonds–Karp algorithm, a breadth-first version of the Ford–Fulkerson technique, after reducing the problem's various sources and destinations into a single-source, single-sink network.</w:t>
+          <w:lang w:val="en-MY"/>
+        </w:rPr>
+      </w:pPr>
+      <w:r>
+        <w:rPr>
+          <w:rFonts w:ascii="Times New Roman" w:hAnsi="Times New Roman" w:cs="Times New Roman"/>
+          <w:sz w:val="22"/>
+          <w:szCs w:val="22"/>
+          <w:lang w:val="en-MY"/>
+        </w:rPr>
+        <w:t xml:space="preserve">The problem involves using the Max-Flow Algorithm in a wildfire evacuation scenario with towns, shelters, and roads. Each town has a population needing evacuation, while each shelter has a maximum capacity, and each road has limited carrying capacity. The challenge </w:t>
+      </w:r>
+      <w:r>
+        <w:rPr>
+          <w:rFonts w:ascii="Times New Roman" w:hAnsi="Times New Roman" w:cs="Times New Roman"/>
+          <w:sz w:val="22"/>
+          <w:szCs w:val="22"/>
+          <w:lang w:val="en-MY"/>
+        </w:rPr>
+        <w:t>is</w:t>
+      </w:r>
+      <w:r>
+        <w:rPr>
+          <w:rFonts w:ascii="Times New Roman" w:hAnsi="Times New Roman" w:cs="Times New Roman"/>
+          <w:sz w:val="22"/>
+          <w:szCs w:val="22"/>
+          <w:lang w:val="en-MY"/>
+        </w:rPr>
+        <w:t xml:space="preserve"> the need for simultaneous coordination since sending residents from one town may block another from accessing safety. This is </w:t>
+      </w:r>
+      <w:r>
+        <w:rPr>
+          <w:rFonts w:ascii="Times New Roman" w:hAnsi="Times New Roman" w:cs="Times New Roman"/>
+          <w:sz w:val="22"/>
+          <w:szCs w:val="22"/>
+          <w:lang w:val="en-MY"/>
+        </w:rPr>
+        <w:t>framed</w:t>
+      </w:r>
+      <w:r>
+        <w:rPr>
+          <w:rFonts w:ascii="Times New Roman" w:hAnsi="Times New Roman" w:cs="Times New Roman"/>
+          <w:sz w:val="22"/>
+          <w:szCs w:val="22"/>
+          <w:lang w:val="en-MY"/>
+        </w:rPr>
+        <w:t xml:space="preserve"> as a maximum flow problem, represented as a directed graph where the road network constitutes the edges, and people represent the flow from towns to shelters. The solution consolidates the towns and shelters into a single source and sink, utilizing the Edmonds–Karp algorithm, a breadth-first approach to the Ford–Fulkerson method.</w:t>
+      </w:r>
+      <w:r>
+        <w:rPr>
+          <w:rFonts w:ascii="Times New Roman" w:hAnsi="Times New Roman" w:cs="Times New Roman"/>
+          <w:sz w:val="22"/>
+          <w:szCs w:val="22"/>
+          <w:lang w:val="en-MY"/>
+        </w:rPr>
+        <w:t xml:space="preserve"> </w:t>
       </w:r>
     </w:p>
     <w:p>
@@ -346,15 +121,19 @@
           <w:rFonts w:ascii="Times New Roman" w:hAnsi="Times New Roman" w:cs="Times New Roman"/>
           <w:b/>
           <w:bCs/>
-          <w:lang w:val="en-MY"/>
-        </w:rPr>
-      </w:pPr>
-    </w:p>
-    <w:p>
-      <w:pPr>
-        <w:spacing w:after="0"/>
-        <w:rPr>
-          <w:rFonts w:ascii="Times New Roman" w:hAnsi="Times New Roman" w:cs="Times New Roman"/>
+          <w:sz w:val="22"/>
+          <w:szCs w:val="22"/>
+          <w:lang w:val="en-MY"/>
+        </w:rPr>
+      </w:pPr>
+    </w:p>
+    <w:p>
+      <w:pPr>
+        <w:spacing w:after="0"/>
+        <w:rPr>
+          <w:rFonts w:ascii="Times New Roman" w:hAnsi="Times New Roman" w:cs="Times New Roman"/>
+          <w:sz w:val="22"/>
+          <w:szCs w:val="22"/>
           <w:lang w:val="en-MY"/>
         </w:rPr>
       </w:pPr>
@@ -363,6 +142,8 @@
           <w:rFonts w:ascii="Times New Roman" w:hAnsi="Times New Roman" w:cs="Times New Roman"/>
           <w:b/>
           <w:bCs/>
+          <w:sz w:val="22"/>
+          <w:szCs w:val="22"/>
           <w:lang w:val="en-MY"/>
         </w:rPr>
         <w:t>Time &amp; Space Analysis</w:t>
@@ -661,6 +442,8 @@
           <w:rFonts w:ascii="Times New Roman" w:hAnsi="Times New Roman" w:cs="Times New Roman"/>
           <w:b/>
           <w:bCs/>
+          <w:sz w:val="22"/>
+          <w:szCs w:val="22"/>
           <w:lang w:val="en-MY"/>
         </w:rPr>
       </w:pPr>
@@ -672,6 +455,8 @@
           <w:rFonts w:ascii="Times New Roman" w:hAnsi="Times New Roman" w:cs="Times New Roman"/>
           <w:b/>
           <w:bCs/>
+          <w:sz w:val="22"/>
+          <w:szCs w:val="22"/>
           <w:lang w:val="en-MY"/>
         </w:rPr>
       </w:pPr>
@@ -680,6 +465,8 @@
           <w:rFonts w:ascii="Times New Roman" w:hAnsi="Times New Roman" w:cs="Times New Roman"/>
           <w:b/>
           <w:bCs/>
+          <w:sz w:val="22"/>
+          <w:szCs w:val="22"/>
           <w:lang w:val="en-MY"/>
         </w:rPr>
         <w:t xml:space="preserve">Time Complexity </w:t>
@@ -704,25 +491,14 @@
         </w:rPr>
         <w:t xml:space="preserve">The time complexity is </w:t>
       </w:r>
-      <w:proofErr w:type="gramStart"/>
-      <w:r>
-        <w:rPr>
-          <w:rFonts w:ascii="Times New Roman" w:hAnsi="Times New Roman" w:cs="Times New Roman"/>
-          <w:sz w:val="22"/>
-          <w:szCs w:val="22"/>
-          <w:lang w:val="en-MY"/>
-        </w:rPr>
-        <w:t>O(</w:t>
-      </w:r>
-      <w:proofErr w:type="gramEnd"/>
-      <w:r>
-        <w:rPr>
-          <w:rFonts w:ascii="Times New Roman" w:hAnsi="Times New Roman" w:cs="Times New Roman"/>
-          <w:sz w:val="22"/>
-          <w:szCs w:val="22"/>
-          <w:lang w:val="en-MY"/>
-        </w:rPr>
-        <w:t>V · E²)</w:t>
+      <w:r>
+        <w:rPr>
+          <w:rFonts w:ascii="Times New Roman" w:hAnsi="Times New Roman" w:cs="Times New Roman"/>
+          <w:sz w:val="22"/>
+          <w:szCs w:val="22"/>
+          <w:lang w:val="en-MY"/>
+        </w:rPr>
+        <w:t>O(V · E²)</w:t>
       </w:r>
       <w:r>
         <w:rPr>
@@ -740,27 +516,25 @@
           <w:szCs w:val="22"/>
           <w:lang w:val="en-MY"/>
         </w:rPr>
-        <w:t xml:space="preserve">of the algorithm performs one breadth-first search, costing </w:t>
-      </w:r>
-      <w:proofErr w:type="gramStart"/>
-      <w:r>
-        <w:rPr>
-          <w:rFonts w:ascii="Times New Roman" w:hAnsi="Times New Roman" w:cs="Times New Roman"/>
-          <w:sz w:val="22"/>
-          <w:szCs w:val="22"/>
-          <w:lang w:val="en-MY"/>
-        </w:rPr>
-        <w:t>O(</w:t>
-      </w:r>
-      <w:proofErr w:type="gramEnd"/>
-      <w:r>
-        <w:rPr>
-          <w:rFonts w:ascii="Times New Roman" w:hAnsi="Times New Roman" w:cs="Times New Roman"/>
-          <w:sz w:val="22"/>
-          <w:szCs w:val="22"/>
-          <w:lang w:val="en-MY"/>
-        </w:rPr>
-        <w:t>V + E) = O(E).</w:t>
+        <w:t xml:space="preserve">of the algorithm performs one </w:t>
+      </w:r>
+      <w:r>
+        <w:rPr>
+          <w:rFonts w:ascii="Times New Roman" w:hAnsi="Times New Roman" w:cs="Times New Roman"/>
+          <w:sz w:val="22"/>
+          <w:szCs w:val="22"/>
+          <w:lang w:val="en-MY"/>
+        </w:rPr>
+        <w:t>Breadth-First Search (BFS)</w:t>
+      </w:r>
+      <w:r>
+        <w:rPr>
+          <w:rFonts w:ascii="Times New Roman" w:hAnsi="Times New Roman" w:cs="Times New Roman"/>
+          <w:sz w:val="22"/>
+          <w:szCs w:val="22"/>
+          <w:lang w:val="en-MY"/>
+        </w:rPr>
+        <w:t xml:space="preserve"> costing O(V + E) = O(E).</w:t>
       </w:r>
       <w:r>
         <w:rPr>
@@ -778,121 +552,70 @@
           <w:szCs w:val="22"/>
           <w:lang w:val="en-MY"/>
         </w:rPr>
-        <w:t>As Breadth-First-Search always chooses the s</w:t>
-      </w:r>
-      <w:r>
-        <w:rPr>
-          <w:rFonts w:ascii="Times New Roman" w:hAnsi="Times New Roman" w:cs="Times New Roman"/>
-          <w:sz w:val="22"/>
-          <w:szCs w:val="22"/>
-          <w:lang w:val="en-MY"/>
-        </w:rPr>
-        <w:t xml:space="preserve">hortest augmenting path, the length of these shortest paths can never decrease between iterations, and a standard argument shows that the number of augmentations is bounded by </w:t>
-      </w:r>
-      <w:proofErr w:type="gramStart"/>
-      <w:r>
-        <w:rPr>
-          <w:rFonts w:ascii="Times New Roman" w:hAnsi="Times New Roman" w:cs="Times New Roman"/>
-          <w:sz w:val="22"/>
-          <w:szCs w:val="22"/>
-          <w:lang w:val="en-MY"/>
-        </w:rPr>
-        <w:t>O(</w:t>
-      </w:r>
-      <w:proofErr w:type="gramEnd"/>
-      <w:r>
-        <w:rPr>
-          <w:rFonts w:ascii="Times New Roman" w:hAnsi="Times New Roman" w:cs="Times New Roman"/>
-          <w:sz w:val="22"/>
-          <w:szCs w:val="22"/>
-          <w:lang w:val="en-MY"/>
-        </w:rPr>
-        <w:t>V · E)</w:t>
-      </w:r>
-      <w:r>
-        <w:rPr>
-          <w:rFonts w:ascii="Times New Roman" w:hAnsi="Times New Roman" w:cs="Times New Roman"/>
-          <w:sz w:val="22"/>
-          <w:szCs w:val="22"/>
-          <w:lang w:val="en-MY"/>
-        </w:rPr>
-        <w:t>. Therefore, m</w:t>
-      </w:r>
-      <w:r>
-        <w:rPr>
-          <w:rFonts w:ascii="Times New Roman" w:hAnsi="Times New Roman" w:cs="Times New Roman"/>
-          <w:sz w:val="22"/>
-          <w:szCs w:val="22"/>
-          <w:lang w:val="en-MY"/>
-        </w:rPr>
-        <w:t xml:space="preserve">ultiplying the two gives </w:t>
-      </w:r>
-      <w:proofErr w:type="gramStart"/>
-      <w:r>
-        <w:rPr>
-          <w:rFonts w:ascii="Times New Roman" w:hAnsi="Times New Roman" w:cs="Times New Roman"/>
-          <w:sz w:val="22"/>
-          <w:szCs w:val="22"/>
-          <w:lang w:val="en-MY"/>
-        </w:rPr>
-        <w:t>O(</w:t>
-      </w:r>
-      <w:proofErr w:type="gramEnd"/>
-      <w:r>
-        <w:rPr>
-          <w:rFonts w:ascii="Times New Roman" w:hAnsi="Times New Roman" w:cs="Times New Roman"/>
-          <w:sz w:val="22"/>
-          <w:szCs w:val="22"/>
-          <w:lang w:val="en-MY"/>
-        </w:rPr>
-        <w:t>V · E²)</w:t>
-      </w:r>
-      <w:r>
-        <w:rPr>
-          <w:rFonts w:ascii="Times New Roman" w:hAnsi="Times New Roman" w:cs="Times New Roman"/>
-          <w:sz w:val="22"/>
-          <w:szCs w:val="22"/>
-          <w:lang w:val="en-MY"/>
-        </w:rPr>
-        <w:t xml:space="preserve">. </w:t>
-      </w:r>
-    </w:p>
-    <w:p>
-      <w:pPr>
-        <w:spacing w:after="0"/>
-        <w:rPr>
-          <w:rFonts w:ascii="Times New Roman" w:hAnsi="Times New Roman" w:cs="Times New Roman"/>
-          <w:sz w:val="22"/>
-          <w:szCs w:val="22"/>
-          <w:lang w:val="en-MY"/>
-        </w:rPr>
-      </w:pPr>
-      <w:r>
-        <w:rPr>
-          <w:rFonts w:ascii="Times New Roman" w:hAnsi="Times New Roman" w:cs="Times New Roman"/>
-          <w:sz w:val="22"/>
-          <w:szCs w:val="22"/>
-          <w:lang w:val="en-MY"/>
-        </w:rPr>
-        <w:t xml:space="preserve">Additionally, this bound is independent of the capacity values themselves. This is because </w:t>
-      </w:r>
-      <w:r>
-        <w:rPr>
-          <w:rFonts w:ascii="Times New Roman" w:hAnsi="Times New Roman" w:cs="Times New Roman"/>
-          <w:sz w:val="22"/>
-          <w:szCs w:val="22"/>
-          <w:lang w:val="en-MY"/>
-        </w:rPr>
-        <w:t>populations and capacities may reach 10⁹, giving a maximum possible answer of 2 × 10¹¹. An implementation whose running time depends on the size of the answer, rather than on the size of the graph, is therefore infeasible</w:t>
-      </w:r>
-      <w:r>
-        <w:rPr>
-          <w:rFonts w:ascii="Times New Roman" w:hAnsi="Times New Roman" w:cs="Times New Roman"/>
-          <w:sz w:val="22"/>
-          <w:szCs w:val="22"/>
-          <w:lang w:val="en-MY"/>
-        </w:rPr>
-        <w:t xml:space="preserve">.  </w:t>
+        <w:t xml:space="preserve">As BFS selects the shortest augmenting path without decreasing its length between iterations, the number of augmentations is limited to O(V · E). </w:t>
+      </w:r>
+      <w:r>
+        <w:rPr>
+          <w:rFonts w:ascii="Times New Roman" w:hAnsi="Times New Roman" w:cs="Times New Roman"/>
+          <w:sz w:val="22"/>
+          <w:szCs w:val="22"/>
+          <w:lang w:val="en-MY"/>
+        </w:rPr>
+        <w:t>Therefore</w:t>
+      </w:r>
+      <w:r>
+        <w:rPr>
+          <w:rFonts w:ascii="Times New Roman" w:hAnsi="Times New Roman" w:cs="Times New Roman"/>
+          <w:sz w:val="22"/>
+          <w:szCs w:val="22"/>
+          <w:lang w:val="en-MY"/>
+        </w:rPr>
+        <w:t>, this results in a complexity of O(V · E²).</w:t>
+      </w:r>
+      <w:r>
+        <w:rPr>
+          <w:rFonts w:ascii="Times New Roman" w:hAnsi="Times New Roman" w:cs="Times New Roman"/>
+          <w:sz w:val="22"/>
+          <w:szCs w:val="22"/>
+          <w:lang w:val="en-MY"/>
+        </w:rPr>
+        <w:t xml:space="preserve"> </w:t>
+      </w:r>
+      <w:r>
+        <w:rPr>
+          <w:rFonts w:ascii="Times New Roman" w:hAnsi="Times New Roman" w:cs="Times New Roman"/>
+          <w:sz w:val="22"/>
+          <w:szCs w:val="22"/>
+          <w:lang w:val="en-MY"/>
+        </w:rPr>
+        <w:t xml:space="preserve"> </w:t>
+      </w:r>
+      <w:r>
+        <w:rPr>
+          <w:rFonts w:ascii="Times New Roman" w:hAnsi="Times New Roman" w:cs="Times New Roman"/>
+          <w:sz w:val="22"/>
+          <w:szCs w:val="22"/>
+          <w:lang w:val="en-MY"/>
+        </w:rPr>
+        <w:t xml:space="preserve">This bound is independent of capacity values, as populations and capacities can reach 10⁹, leading to a maximum possible answer of 2 × 10¹¹. An implementation </w:t>
+      </w:r>
+      <w:r>
+        <w:rPr>
+          <w:rFonts w:ascii="Times New Roman" w:hAnsi="Times New Roman" w:cs="Times New Roman"/>
+          <w:sz w:val="22"/>
+          <w:szCs w:val="22"/>
+          <w:lang w:val="en-MY"/>
+        </w:rPr>
+        <w:t>relying</w:t>
+      </w:r>
+      <w:r>
+        <w:rPr>
+          <w:rFonts w:ascii="Times New Roman" w:hAnsi="Times New Roman" w:cs="Times New Roman"/>
+          <w:sz w:val="22"/>
+          <w:szCs w:val="22"/>
+          <w:lang w:val="en-MY"/>
+        </w:rPr>
+        <w:t xml:space="preserve"> on the answer's size, rather than the graph's size, is infeasible.</w:t>
       </w:r>
     </w:p>
     <w:p>
@@ -902,6 +625,8 @@
           <w:rFonts w:ascii="Times New Roman" w:hAnsi="Times New Roman" w:cs="Times New Roman"/>
           <w:b/>
           <w:bCs/>
+          <w:sz w:val="22"/>
+          <w:szCs w:val="22"/>
           <w:lang w:val="en-MY"/>
         </w:rPr>
       </w:pPr>
@@ -913,6 +638,8 @@
           <w:rFonts w:ascii="Times New Roman" w:hAnsi="Times New Roman" w:cs="Times New Roman"/>
           <w:b/>
           <w:bCs/>
+          <w:sz w:val="22"/>
+          <w:szCs w:val="22"/>
           <w:lang w:val="en-MY"/>
         </w:rPr>
       </w:pPr>
@@ -921,6 +648,8 @@
           <w:rFonts w:ascii="Times New Roman" w:hAnsi="Times New Roman" w:cs="Times New Roman"/>
           <w:b/>
           <w:bCs/>
+          <w:sz w:val="22"/>
+          <w:szCs w:val="22"/>
           <w:lang w:val="en-MY"/>
         </w:rPr>
         <w:t>Space complexity</w:t>
@@ -954,25 +683,14 @@
         </w:rPr>
         <w:t xml:space="preserve">The space complexity is </w:t>
       </w:r>
-      <w:proofErr w:type="gramStart"/>
-      <w:r>
-        <w:rPr>
-          <w:rFonts w:ascii="Times New Roman" w:hAnsi="Times New Roman" w:cs="Times New Roman"/>
-          <w:sz w:val="22"/>
-          <w:szCs w:val="22"/>
-          <w:lang w:val="en-MY"/>
-        </w:rPr>
-        <w:t>O(</w:t>
-      </w:r>
-      <w:proofErr w:type="gramEnd"/>
-      <w:r>
-        <w:rPr>
-          <w:rFonts w:ascii="Times New Roman" w:hAnsi="Times New Roman" w:cs="Times New Roman"/>
-          <w:sz w:val="22"/>
-          <w:szCs w:val="22"/>
-          <w:lang w:val="en-MY"/>
-        </w:rPr>
-        <w:t>V + E). The network is stored as an adjacency map recording, for each edge and its reverse, a capacity and a current flow. The breadth-first search additionally maintains a queue and a parent map, each of size O(V). No structure grows with the magnitude of the capacities.</w:t>
+      <w:r>
+        <w:rPr>
+          <w:rFonts w:ascii="Times New Roman" w:hAnsi="Times New Roman" w:cs="Times New Roman"/>
+          <w:sz w:val="22"/>
+          <w:szCs w:val="22"/>
+          <w:lang w:val="en-MY"/>
+        </w:rPr>
+        <w:t>O(V + E). The network is stored as an adjacency map recording, for each edge and its reverse, a capacity and a current flow. The breadth-first search additionally maintains a queue and a parent map, each of size O(V). No structure grows with the magnitude of the capacities.</w:t>
       </w:r>
     </w:p>
     <w:p>
@@ -982,6 +700,8 @@
           <w:rFonts w:ascii="Times New Roman" w:hAnsi="Times New Roman" w:cs="Times New Roman"/>
           <w:b/>
           <w:bCs/>
+          <w:sz w:val="22"/>
+          <w:szCs w:val="22"/>
           <w:lang w:val="en-MY"/>
         </w:rPr>
       </w:pPr>
@@ -993,6 +713,8 @@
           <w:rFonts w:ascii="Times New Roman" w:hAnsi="Times New Roman" w:cs="Times New Roman"/>
           <w:b/>
           <w:bCs/>
+          <w:sz w:val="22"/>
+          <w:szCs w:val="22"/>
           <w:lang w:val="en-MY"/>
         </w:rPr>
       </w:pPr>
@@ -1001,6 +723,8 @@
           <w:rFonts w:ascii="Times New Roman" w:hAnsi="Times New Roman" w:cs="Times New Roman"/>
           <w:b/>
           <w:bCs/>
+          <w:sz w:val="22"/>
+          <w:szCs w:val="22"/>
           <w:lang w:val="en-MY"/>
         </w:rPr>
         <w:t>Solution</w:t>
@@ -1066,7 +790,6 @@
           <w:szCs w:val="22"/>
           <w:lang w:val="en-MY"/>
         </w:rPr>
-        <w:lastRenderedPageBreak/>
         <w:t xml:space="preserve">A </w:t>
       </w:r>
       <w:r>
@@ -1302,6 +1025,8 @@
           <w:rFonts w:ascii="Times New Roman" w:hAnsi="Times New Roman" w:cs="Times New Roman"/>
           <w:b/>
           <w:bCs/>
+          <w:sz w:val="22"/>
+          <w:szCs w:val="22"/>
           <w:lang w:val="en-MY"/>
         </w:rPr>
       </w:pPr>
@@ -1313,6 +1038,8 @@
           <w:rFonts w:ascii="Times New Roman" w:hAnsi="Times New Roman" w:cs="Times New Roman"/>
           <w:b/>
           <w:bCs/>
+          <w:sz w:val="22"/>
+          <w:szCs w:val="22"/>
           <w:lang w:val="en-MY"/>
         </w:rPr>
       </w:pPr>
@@ -1321,9 +1048,12 @@
           <w:rFonts w:ascii="Times New Roman" w:hAnsi="Times New Roman" w:cs="Times New Roman"/>
           <w:b/>
           <w:bCs/>
-          <w:lang w:val="en-MY"/>
-        </w:rPr>
-        <w:t>The Edmonds–Karp algorithm</w:t>
+          <w:sz w:val="22"/>
+          <w:szCs w:val="22"/>
+          <w:lang w:val="en-MY"/>
+        </w:rPr>
+        <w:lastRenderedPageBreak/>
+        <w:t>The EdmondsKarp algorithm</w:t>
       </w:r>
     </w:p>
     <w:p>
@@ -1441,6 +1171,8 @@
           <w:rFonts w:ascii="Times New Roman" w:hAnsi="Times New Roman" w:cs="Times New Roman"/>
           <w:b/>
           <w:bCs/>
+          <w:sz w:val="22"/>
+          <w:szCs w:val="22"/>
           <w:lang w:val="en-MY"/>
         </w:rPr>
       </w:pPr>
@@ -1452,6 +1184,8 @@
           <w:rFonts w:ascii="Times New Roman" w:hAnsi="Times New Roman" w:cs="Times New Roman"/>
           <w:b/>
           <w:bCs/>
+          <w:sz w:val="22"/>
+          <w:szCs w:val="22"/>
           <w:lang w:val="en-MY"/>
         </w:rPr>
       </w:pPr>
@@ -1460,6 +1194,8 @@
           <w:rFonts w:ascii="Times New Roman" w:hAnsi="Times New Roman" w:cs="Times New Roman"/>
           <w:b/>
           <w:bCs/>
+          <w:sz w:val="22"/>
+          <w:szCs w:val="22"/>
           <w:lang w:val="en-MY"/>
         </w:rPr>
         <w:t>Correctness</w:t>
@@ -1510,6 +1246,8 @@
           <w:rFonts w:ascii="Times New Roman" w:hAnsi="Times New Roman" w:cs="Times New Roman"/>
           <w:b/>
           <w:bCs/>
+          <w:sz w:val="22"/>
+          <w:szCs w:val="22"/>
           <w:lang w:val="en-MY"/>
         </w:rPr>
       </w:pPr>
@@ -1521,6 +1259,8 @@
           <w:rFonts w:ascii="Times New Roman" w:hAnsi="Times New Roman" w:cs="Times New Roman"/>
           <w:b/>
           <w:bCs/>
+          <w:sz w:val="22"/>
+          <w:szCs w:val="22"/>
           <w:lang w:val="en-MY"/>
         </w:rPr>
       </w:pPr>
@@ -1529,6 +1269,8 @@
           <w:rFonts w:ascii="Times New Roman" w:hAnsi="Times New Roman" w:cs="Times New Roman"/>
           <w:b/>
           <w:bCs/>
+          <w:sz w:val="22"/>
+          <w:szCs w:val="22"/>
           <w:lang w:val="en-MY"/>
         </w:rPr>
         <w:t>Incorrect approaches</w:t>
@@ -1551,7 +1293,25 @@
           <w:szCs w:val="22"/>
           <w:lang w:val="en-MY"/>
         </w:rPr>
-        <w:t>The test data is designed to reject three plausible but flawed approaches:</w:t>
+        <w:t xml:space="preserve">The test data is designed to reject three </w:t>
+      </w:r>
+      <w:r>
+        <w:rPr>
+          <w:rFonts w:ascii="Times New Roman" w:hAnsi="Times New Roman" w:cs="Times New Roman"/>
+          <w:sz w:val="22"/>
+          <w:szCs w:val="22"/>
+          <w:lang w:val="en-MY"/>
+        </w:rPr>
+        <w:t>possible</w:t>
+      </w:r>
+      <w:r>
+        <w:rPr>
+          <w:rFonts w:ascii="Times New Roman" w:hAnsi="Times New Roman" w:cs="Times New Roman"/>
+          <w:sz w:val="22"/>
+          <w:szCs w:val="22"/>
+          <w:lang w:val="en-MY"/>
+        </w:rPr>
+        <w:t xml:space="preserve"> but flawed approaches:</w:t>
       </w:r>
     </w:p>
     <w:p>
@@ -1576,7 +1336,16 @@
           <w:szCs w:val="22"/>
           <w:lang w:val="en-MY"/>
         </w:rPr>
-        <w:t>Omitting the super-source and super-sink, and instead computing flow only from the first town to the first shelter. This ignores all other towns and shelters and underestimates the answer.</w:t>
+        <w:t>Excluding</w:t>
+      </w:r>
+      <w:r>
+        <w:rPr>
+          <w:rFonts w:ascii="Times New Roman" w:hAnsi="Times New Roman" w:cs="Times New Roman"/>
+          <w:sz w:val="22"/>
+          <w:szCs w:val="22"/>
+          <w:lang w:val="en-MY"/>
+        </w:rPr>
+        <w:t xml:space="preserve"> the super-source and super-sink, and instead computing flow only from the first town to the first shelter. This ignores all other towns and shelters and underestimates the answer.</w:t>
       </w:r>
     </w:p>
     <w:p>
@@ -1636,6 +1405,8 @@
           <w:rFonts w:ascii="Times New Roman" w:hAnsi="Times New Roman" w:cs="Times New Roman"/>
           <w:b/>
           <w:bCs/>
+          <w:sz w:val="22"/>
+          <w:szCs w:val="22"/>
           <w:lang w:val="en-MY"/>
         </w:rPr>
       </w:pPr>
@@ -1647,6 +1418,8 @@
           <w:rFonts w:ascii="Times New Roman" w:hAnsi="Times New Roman" w:cs="Times New Roman"/>
           <w:b/>
           <w:bCs/>
+          <w:sz w:val="22"/>
+          <w:szCs w:val="22"/>
           <w:lang w:val="en-MY"/>
         </w:rPr>
       </w:pPr>
@@ -1655,6 +1428,8 @@
           <w:rFonts w:ascii="Times New Roman" w:hAnsi="Times New Roman" w:cs="Times New Roman"/>
           <w:b/>
           <w:bCs/>
+          <w:sz w:val="22"/>
+          <w:szCs w:val="22"/>
           <w:lang w:val="en-MY"/>
         </w:rPr>
         <w:t>AI Declaration</w:t>
@@ -1677,8 +1452,43 @@
           <w:szCs w:val="22"/>
           <w:lang w:val="en-MY"/>
         </w:rPr>
-        <w:lastRenderedPageBreak/>
-        <w:t xml:space="preserve">I utilised Generative AI to help refine the Wildfire Evacuation story to verify if the story aligns with the Max-Flow algorithm as the original story were missing some gaps that I overlooked. Additionally, I used it to help generate the sample and secret data. Furthermore, I have used the Gen AI to test my understanding of the project’s briefing to ensure that I was on the right check by asking clarifications. I have also used it to test my understanding of the Max-Flow Algorithm by sending it my own understanding of the algorithm in my own words as this was one of the recent lecture topics that were taught in that time. </w:t>
+        <w:t xml:space="preserve">I utilised Generative AI to help refine the Wildfire Evacuation story to verify if the story aligns with the Max-Flow algorithm as the original story were missing some gaps that I overlooked. Additionally, </w:t>
+      </w:r>
+      <w:r>
+        <w:rPr>
+          <w:rFonts w:ascii="Times New Roman" w:hAnsi="Times New Roman" w:cs="Times New Roman"/>
+          <w:sz w:val="22"/>
+          <w:szCs w:val="22"/>
+          <w:lang w:val="en-MY"/>
+        </w:rPr>
+        <w:t xml:space="preserve">I used it to </w:t>
+      </w:r>
+      <w:r>
+        <w:rPr>
+          <w:rFonts w:ascii="Times New Roman" w:hAnsi="Times New Roman" w:cs="Times New Roman"/>
+          <w:sz w:val="22"/>
+          <w:szCs w:val="22"/>
+          <w:lang w:val="en-MY"/>
+        </w:rPr>
+        <w:t>verify whether the secret and sample data that I have generated on my own were correct and made sense</w:t>
+      </w:r>
+      <w:r>
+        <w:rPr>
+          <w:rFonts w:ascii="Times New Roman" w:hAnsi="Times New Roman" w:cs="Times New Roman"/>
+          <w:sz w:val="22"/>
+          <w:szCs w:val="22"/>
+          <w:lang w:val="en-MY"/>
+        </w:rPr>
+        <w:t>.</w:t>
+      </w:r>
+      <w:r>
+        <w:rPr>
+          <w:rFonts w:ascii="Times New Roman" w:hAnsi="Times New Roman" w:cs="Times New Roman"/>
+          <w:sz w:val="22"/>
+          <w:szCs w:val="22"/>
+          <w:lang w:val="en-MY"/>
+        </w:rPr>
+        <w:t xml:space="preserve"> Furthermore, I have used the Gen AI to test my understanding of the project’s briefing to ensure that I was on the right check by asking clarifications. I have also used it to test my understanding of the Max-Flow Algorithm by sending it my own understanding of the algorithm in my own words as this was one of the recent lecture topics that were taught in that time. </w:t>
       </w:r>
     </w:p>
     <w:sectPr>
@@ -3481,6 +3291,72 @@
     <w:uiPriority w:val="99"/>
     <w:rsid w:val="00325A5C"/>
   </w:style>
+  <w:style w:type="character" w:styleId="CommentReference">
+    <w:name w:val="annotation reference"/>
+    <w:basedOn w:val="DefaultParagraphFont"/>
+    <w:uiPriority w:val="99"/>
+    <w:semiHidden/>
+    <w:unhideWhenUsed/>
+    <w:rsid w:val="000B7FA8"/>
+    <w:rPr>
+      <w:sz w:val="16"/>
+      <w:szCs w:val="16"/>
+    </w:rPr>
+  </w:style>
+  <w:style w:type="paragraph" w:styleId="CommentText">
+    <w:name w:val="annotation text"/>
+    <w:basedOn w:val="Normal"/>
+    <w:link w:val="CommentTextChar"/>
+    <w:uiPriority w:val="99"/>
+    <w:unhideWhenUsed/>
+    <w:rsid w:val="000B7FA8"/>
+    <w:pPr>
+      <w:spacing w:line="240" w:lineRule="auto"/>
+    </w:pPr>
+    <w:rPr>
+      <w:sz w:val="20"/>
+      <w:szCs w:val="20"/>
+    </w:rPr>
+  </w:style>
+  <w:style w:type="character" w:customStyle="1" w:styleId="CommentTextChar">
+    <w:name w:val="Comment Text Char"/>
+    <w:basedOn w:val="DefaultParagraphFont"/>
+    <w:link w:val="CommentText"/>
+    <w:uiPriority w:val="99"/>
+    <w:rsid w:val="000B7FA8"/>
+    <w:rPr>
+      <w:sz w:val="20"/>
+      <w:szCs w:val="20"/>
+    </w:rPr>
+  </w:style>
+  <w:style w:type="paragraph" w:styleId="CommentSubject">
+    <w:name w:val="annotation subject"/>
+    <w:basedOn w:val="CommentText"/>
+    <w:next w:val="CommentText"/>
+    <w:link w:val="CommentSubjectChar"/>
+    <w:uiPriority w:val="99"/>
+    <w:semiHidden/>
+    <w:unhideWhenUsed/>
+    <w:rsid w:val="000B7FA8"/>
+    <w:rPr>
+      <w:b/>
+      <w:bCs/>
+    </w:rPr>
+  </w:style>
+  <w:style w:type="character" w:customStyle="1" w:styleId="CommentSubjectChar">
+    <w:name w:val="Comment Subject Char"/>
+    <w:basedOn w:val="CommentTextChar"/>
+    <w:link w:val="CommentSubject"/>
+    <w:uiPriority w:val="99"/>
+    <w:semiHidden/>
+    <w:rsid w:val="000B7FA8"/>
+    <w:rPr>
+      <w:b/>
+      <w:bCs/>
+      <w:sz w:val="20"/>
+      <w:szCs w:val="20"/>
+    </w:rPr>
+  </w:style>
 </w:styles>
 </file>
 

</xml_diff>

<commit_message>
added comments to explain what some functions does for better understanding
</commit_message>
<xml_diff>
--- a/problems/wildfireevacuation/WildfireEvacuation_Editorial_24849627.docx
+++ b/problems/wildfireevacuation/WildfireEvacuation_Editorial_24849627.docx
@@ -1053,7 +1053,31 @@
           <w:lang w:val="en-MY"/>
         </w:rPr>
         <w:lastRenderedPageBreak/>
-        <w:t>The EdmondsKarp algorithm</w:t>
+        <w:t xml:space="preserve">The </w:t>
+      </w:r>
+      <w:proofErr w:type="spellStart"/>
+      <w:r>
+        <w:rPr>
+          <w:rFonts w:ascii="Times New Roman" w:hAnsi="Times New Roman" w:cs="Times New Roman"/>
+          <w:b/>
+          <w:bCs/>
+          <w:sz w:val="22"/>
+          <w:szCs w:val="22"/>
+          <w:lang w:val="en-MY"/>
+        </w:rPr>
+        <w:t>EdmondsKarp</w:t>
+      </w:r>
+      <w:proofErr w:type="spellEnd"/>
+      <w:r>
+        <w:rPr>
+          <w:rFonts w:ascii="Times New Roman" w:hAnsi="Times New Roman" w:cs="Times New Roman"/>
+          <w:b/>
+          <w:bCs/>
+          <w:sz w:val="22"/>
+          <w:szCs w:val="22"/>
+          <w:lang w:val="en-MY"/>
+        </w:rPr>
+        <w:t xml:space="preserve"> algorithm</w:t>
       </w:r>
     </w:p>
     <w:p>
@@ -1169,6 +1193,1143 @@
         <w:spacing w:after="0"/>
         <w:rPr>
           <w:rFonts w:ascii="Times New Roman" w:hAnsi="Times New Roman" w:cs="Times New Roman"/>
+          <w:sz w:val="22"/>
+          <w:szCs w:val="22"/>
+          <w:lang w:val="en-MY"/>
+        </w:rPr>
+      </w:pPr>
+    </w:p>
+    <w:p>
+      <w:pPr>
+        <w:spacing w:after="0"/>
+        <w:rPr>
+          <w:rFonts w:ascii="Times New Roman" w:hAnsi="Times New Roman" w:cs="Times New Roman"/>
+          <w:sz w:val="22"/>
+          <w:szCs w:val="22"/>
+          <w:lang w:val="en-MY"/>
+        </w:rPr>
+      </w:pPr>
+      <w:r>
+        <w:rPr>
+          <w:rFonts w:ascii="Times New Roman" w:hAnsi="Times New Roman" w:cs="Times New Roman"/>
+          <w:b/>
+          <w:bCs/>
+          <w:sz w:val="22"/>
+          <w:szCs w:val="22"/>
+          <w:lang w:val="en-MY"/>
+        </w:rPr>
+        <w:t>Pseudocode:</w:t>
+      </w:r>
+    </w:p>
+    <w:p>
+      <w:pPr>
+        <w:spacing w:after="0"/>
+        <w:rPr>
+          <w:rFonts w:ascii="Times New Roman" w:hAnsi="Times New Roman" w:cs="Times New Roman"/>
+          <w:sz w:val="22"/>
+          <w:szCs w:val="22"/>
+          <w:lang w:val="en-MY"/>
+        </w:rPr>
+      </w:pPr>
+      <w:r>
+        <w:rPr>
+          <w:rFonts w:ascii="Times New Roman" w:hAnsi="Times New Roman" w:cs="Times New Roman"/>
+          <w:sz w:val="22"/>
+          <w:szCs w:val="22"/>
+          <w:lang w:val="en-MY"/>
+        </w:rPr>
+        <w:t>function MAX_EVACUATED(T, S, p, c, roads):</w:t>
+      </w:r>
+    </w:p>
+    <w:p>
+      <w:pPr>
+        <w:spacing w:after="0"/>
+        <w:rPr>
+          <w:rFonts w:ascii="Times New Roman" w:hAnsi="Times New Roman" w:cs="Times New Roman"/>
+          <w:sz w:val="22"/>
+          <w:szCs w:val="22"/>
+          <w:lang w:val="en-MY"/>
+        </w:rPr>
+      </w:pPr>
+      <w:r>
+        <w:rPr>
+          <w:rFonts w:ascii="Times New Roman" w:hAnsi="Times New Roman" w:cs="Times New Roman"/>
+          <w:sz w:val="22"/>
+          <w:szCs w:val="22"/>
+          <w:lang w:val="en-MY"/>
+        </w:rPr>
+        <w:t xml:space="preserve">    SOURCE ← 0</w:t>
+      </w:r>
+    </w:p>
+    <w:p>
+      <w:pPr>
+        <w:spacing w:after="0"/>
+        <w:rPr>
+          <w:rFonts w:ascii="Times New Roman" w:hAnsi="Times New Roman" w:cs="Times New Roman"/>
+          <w:sz w:val="22"/>
+          <w:szCs w:val="22"/>
+          <w:lang w:val="en-MY"/>
+        </w:rPr>
+      </w:pPr>
+      <w:r>
+        <w:rPr>
+          <w:rFonts w:ascii="Times New Roman" w:hAnsi="Times New Roman" w:cs="Times New Roman"/>
+          <w:sz w:val="22"/>
+          <w:szCs w:val="22"/>
+          <w:lang w:val="en-MY"/>
+        </w:rPr>
+        <w:t xml:space="preserve">    SINK   ← T + S + 1</w:t>
+      </w:r>
+    </w:p>
+    <w:p>
+      <w:pPr>
+        <w:spacing w:after="0"/>
+        <w:rPr>
+          <w:rFonts w:ascii="Times New Roman" w:hAnsi="Times New Roman" w:cs="Times New Roman"/>
+          <w:sz w:val="22"/>
+          <w:szCs w:val="22"/>
+          <w:lang w:val="en-MY"/>
+        </w:rPr>
+      </w:pPr>
+      <w:r>
+        <w:rPr>
+          <w:rFonts w:ascii="Times New Roman" w:hAnsi="Times New Roman" w:cs="Times New Roman"/>
+          <w:sz w:val="22"/>
+          <w:szCs w:val="22"/>
+          <w:lang w:val="en-MY"/>
+        </w:rPr>
+        <w:t xml:space="preserve">    cap    ← empty map                        // cap[u][v] = capacity of edge u → v</w:t>
+      </w:r>
+    </w:p>
+    <w:p>
+      <w:pPr>
+        <w:spacing w:after="0"/>
+        <w:rPr>
+          <w:rFonts w:ascii="Times New Roman" w:hAnsi="Times New Roman" w:cs="Times New Roman"/>
+          <w:sz w:val="22"/>
+          <w:szCs w:val="22"/>
+          <w:lang w:val="en-MY"/>
+        </w:rPr>
+      </w:pPr>
+    </w:p>
+    <w:p>
+      <w:pPr>
+        <w:spacing w:after="0"/>
+        <w:rPr>
+          <w:rFonts w:ascii="Times New Roman" w:hAnsi="Times New Roman" w:cs="Times New Roman"/>
+          <w:sz w:val="22"/>
+          <w:szCs w:val="22"/>
+          <w:lang w:val="en-MY"/>
+        </w:rPr>
+      </w:pPr>
+      <w:r>
+        <w:rPr>
+          <w:rFonts w:ascii="Times New Roman" w:hAnsi="Times New Roman" w:cs="Times New Roman"/>
+          <w:sz w:val="22"/>
+          <w:szCs w:val="22"/>
+          <w:lang w:val="en-MY"/>
+        </w:rPr>
+        <w:t xml:space="preserve">    for i ← 1 to T:                           // super-source → each town</w:t>
+      </w:r>
+    </w:p>
+    <w:p>
+      <w:pPr>
+        <w:spacing w:after="0"/>
+        <w:rPr>
+          <w:rFonts w:ascii="Times New Roman" w:hAnsi="Times New Roman" w:cs="Times New Roman"/>
+          <w:sz w:val="22"/>
+          <w:szCs w:val="22"/>
+          <w:lang w:val="en-MY"/>
+        </w:rPr>
+      </w:pPr>
+      <w:r>
+        <w:rPr>
+          <w:rFonts w:ascii="Times New Roman" w:hAnsi="Times New Roman" w:cs="Times New Roman"/>
+          <w:sz w:val="22"/>
+          <w:szCs w:val="22"/>
+          <w:lang w:val="en-MY"/>
+        </w:rPr>
+        <w:t xml:space="preserve">        ADD_EDGE(SOURCE, i, p[i])</w:t>
+      </w:r>
+    </w:p>
+    <w:p>
+      <w:pPr>
+        <w:spacing w:after="0"/>
+        <w:rPr>
+          <w:rFonts w:ascii="Times New Roman" w:hAnsi="Times New Roman" w:cs="Times New Roman"/>
+          <w:sz w:val="22"/>
+          <w:szCs w:val="22"/>
+          <w:lang w:val="en-MY"/>
+        </w:rPr>
+      </w:pPr>
+      <w:r>
+        <w:rPr>
+          <w:rFonts w:ascii="Times New Roman" w:hAnsi="Times New Roman" w:cs="Times New Roman"/>
+          <w:sz w:val="22"/>
+          <w:szCs w:val="22"/>
+          <w:lang w:val="en-MY"/>
+        </w:rPr>
+        <w:t xml:space="preserve">    for j ← 1 to S:                           // each shelter → super-sink</w:t>
+      </w:r>
+    </w:p>
+    <w:p>
+      <w:pPr>
+        <w:spacing w:after="0"/>
+        <w:rPr>
+          <w:rFonts w:ascii="Times New Roman" w:hAnsi="Times New Roman" w:cs="Times New Roman"/>
+          <w:sz w:val="22"/>
+          <w:szCs w:val="22"/>
+          <w:lang w:val="en-MY"/>
+        </w:rPr>
+      </w:pPr>
+      <w:r>
+        <w:rPr>
+          <w:rFonts w:ascii="Times New Roman" w:hAnsi="Times New Roman" w:cs="Times New Roman"/>
+          <w:sz w:val="22"/>
+          <w:szCs w:val="22"/>
+          <w:lang w:val="en-MY"/>
+        </w:rPr>
+        <w:t xml:space="preserve">        ADD_EDGE(T + j, SINK, c[j])</w:t>
+      </w:r>
+    </w:p>
+    <w:p>
+      <w:pPr>
+        <w:spacing w:after="0"/>
+        <w:rPr>
+          <w:rFonts w:ascii="Times New Roman" w:hAnsi="Times New Roman" w:cs="Times New Roman"/>
+          <w:sz w:val="22"/>
+          <w:szCs w:val="22"/>
+          <w:lang w:val="en-MY"/>
+        </w:rPr>
+      </w:pPr>
+      <w:r>
+        <w:rPr>
+          <w:rFonts w:ascii="Times New Roman" w:hAnsi="Times New Roman" w:cs="Times New Roman"/>
+          <w:sz w:val="22"/>
+          <w:szCs w:val="22"/>
+          <w:lang w:val="en-MY"/>
+        </w:rPr>
+        <w:t xml:space="preserve">    for each road (u, v, w) in roads:         // one-way roads</w:t>
+      </w:r>
+    </w:p>
+    <w:p>
+      <w:pPr>
+        <w:spacing w:after="0"/>
+        <w:rPr>
+          <w:rFonts w:ascii="Times New Roman" w:hAnsi="Times New Roman" w:cs="Times New Roman"/>
+          <w:sz w:val="22"/>
+          <w:szCs w:val="22"/>
+          <w:lang w:val="en-MY"/>
+        </w:rPr>
+      </w:pPr>
+      <w:r>
+        <w:rPr>
+          <w:rFonts w:ascii="Times New Roman" w:hAnsi="Times New Roman" w:cs="Times New Roman"/>
+          <w:sz w:val="22"/>
+          <w:szCs w:val="22"/>
+          <w:lang w:val="en-MY"/>
+        </w:rPr>
+        <w:t xml:space="preserve">        ADD_EDGE(u, v, w)</w:t>
+      </w:r>
+    </w:p>
+    <w:p>
+      <w:pPr>
+        <w:spacing w:after="0"/>
+        <w:rPr>
+          <w:rFonts w:ascii="Times New Roman" w:hAnsi="Times New Roman" w:cs="Times New Roman"/>
+          <w:sz w:val="22"/>
+          <w:szCs w:val="22"/>
+          <w:lang w:val="en-MY"/>
+        </w:rPr>
+      </w:pPr>
+    </w:p>
+    <w:p>
+      <w:pPr>
+        <w:spacing w:after="0"/>
+        <w:rPr>
+          <w:rFonts w:ascii="Times New Roman" w:hAnsi="Times New Roman" w:cs="Times New Roman"/>
+          <w:sz w:val="22"/>
+          <w:szCs w:val="22"/>
+          <w:lang w:val="en-MY"/>
+        </w:rPr>
+      </w:pPr>
+      <w:r>
+        <w:rPr>
+          <w:rFonts w:ascii="Times New Roman" w:hAnsi="Times New Roman" w:cs="Times New Roman"/>
+          <w:sz w:val="22"/>
+          <w:szCs w:val="22"/>
+          <w:lang w:val="en-MY"/>
+        </w:rPr>
+        <w:t xml:space="preserve">    return EDMONDS_KARP(cap, SOURCE, SINK)</w:t>
+      </w:r>
+    </w:p>
+    <w:p>
+      <w:pPr>
+        <w:spacing w:after="0"/>
+        <w:rPr>
+          <w:rFonts w:ascii="Times New Roman" w:hAnsi="Times New Roman" w:cs="Times New Roman"/>
+          <w:sz w:val="22"/>
+          <w:szCs w:val="22"/>
+          <w:lang w:val="en-MY"/>
+        </w:rPr>
+      </w:pPr>
+    </w:p>
+    <w:p>
+      <w:pPr>
+        <w:spacing w:after="0"/>
+        <w:rPr>
+          <w:rFonts w:ascii="Times New Roman" w:hAnsi="Times New Roman" w:cs="Times New Roman"/>
+          <w:sz w:val="22"/>
+          <w:szCs w:val="22"/>
+          <w:lang w:val="en-MY"/>
+        </w:rPr>
+      </w:pPr>
+    </w:p>
+    <w:p>
+      <w:pPr>
+        <w:spacing w:after="0"/>
+        <w:rPr>
+          <w:rFonts w:ascii="Times New Roman" w:hAnsi="Times New Roman" w:cs="Times New Roman"/>
+          <w:sz w:val="22"/>
+          <w:szCs w:val="22"/>
+          <w:lang w:val="en-MY"/>
+        </w:rPr>
+      </w:pPr>
+      <w:r>
+        <w:rPr>
+          <w:rFonts w:ascii="Times New Roman" w:hAnsi="Times New Roman" w:cs="Times New Roman"/>
+          <w:sz w:val="22"/>
+          <w:szCs w:val="22"/>
+          <w:lang w:val="en-MY"/>
+        </w:rPr>
+        <w:t>function ADD_EDGE(u, v, w):</w:t>
+      </w:r>
+    </w:p>
+    <w:p>
+      <w:pPr>
+        <w:spacing w:after="0"/>
+        <w:rPr>
+          <w:rFonts w:ascii="Times New Roman" w:hAnsi="Times New Roman" w:cs="Times New Roman"/>
+          <w:sz w:val="22"/>
+          <w:szCs w:val="22"/>
+          <w:lang w:val="en-MY"/>
+        </w:rPr>
+      </w:pPr>
+      <w:r>
+        <w:rPr>
+          <w:rFonts w:ascii="Times New Roman" w:hAnsi="Times New Roman" w:cs="Times New Roman"/>
+          <w:sz w:val="22"/>
+          <w:szCs w:val="22"/>
+          <w:lang w:val="en-MY"/>
+        </w:rPr>
+        <w:t xml:space="preserve">    cap[u][v] ← cap[u][v] + w                 // duplicate roads are summed</w:t>
+      </w:r>
+    </w:p>
+    <w:p>
+      <w:pPr>
+        <w:spacing w:after="0"/>
+        <w:rPr>
+          <w:rFonts w:ascii="Times New Roman" w:hAnsi="Times New Roman" w:cs="Times New Roman"/>
+          <w:sz w:val="22"/>
+          <w:szCs w:val="22"/>
+          <w:lang w:val="en-MY"/>
+        </w:rPr>
+      </w:pPr>
+    </w:p>
+    <w:p>
+      <w:pPr>
+        <w:spacing w:after="0"/>
+        <w:rPr>
+          <w:rFonts w:ascii="Times New Roman" w:hAnsi="Times New Roman" w:cs="Times New Roman"/>
+          <w:sz w:val="22"/>
+          <w:szCs w:val="22"/>
+          <w:lang w:val="en-MY"/>
+        </w:rPr>
+      </w:pPr>
+    </w:p>
+    <w:p>
+      <w:pPr>
+        <w:spacing w:after="0"/>
+        <w:rPr>
+          <w:rFonts w:ascii="Times New Roman" w:hAnsi="Times New Roman" w:cs="Times New Roman"/>
+          <w:sz w:val="22"/>
+          <w:szCs w:val="22"/>
+          <w:lang w:val="en-MY"/>
+        </w:rPr>
+      </w:pPr>
+      <w:r>
+        <w:rPr>
+          <w:rFonts w:ascii="Times New Roman" w:hAnsi="Times New Roman" w:cs="Times New Roman"/>
+          <w:sz w:val="22"/>
+          <w:szCs w:val="22"/>
+          <w:lang w:val="en-MY"/>
+        </w:rPr>
+        <w:t>function EDMONDS_KARP(cap, s, t):</w:t>
+      </w:r>
+    </w:p>
+    <w:p>
+      <w:pPr>
+        <w:spacing w:after="0"/>
+        <w:rPr>
+          <w:rFonts w:ascii="Times New Roman" w:hAnsi="Times New Roman" w:cs="Times New Roman"/>
+          <w:sz w:val="22"/>
+          <w:szCs w:val="22"/>
+          <w:lang w:val="en-MY"/>
+        </w:rPr>
+      </w:pPr>
+      <w:r>
+        <w:rPr>
+          <w:rFonts w:ascii="Times New Roman" w:hAnsi="Times New Roman" w:cs="Times New Roman"/>
+          <w:sz w:val="22"/>
+          <w:szCs w:val="22"/>
+          <w:lang w:val="en-MY"/>
+        </w:rPr>
+        <w:t xml:space="preserve">    for each edge (u, v) in cap:              // create reverse edges</w:t>
+      </w:r>
+    </w:p>
+    <w:p>
+      <w:pPr>
+        <w:spacing w:after="0"/>
+        <w:rPr>
+          <w:rFonts w:ascii="Times New Roman" w:hAnsi="Times New Roman" w:cs="Times New Roman"/>
+          <w:sz w:val="22"/>
+          <w:szCs w:val="22"/>
+          <w:lang w:val="en-MY"/>
+        </w:rPr>
+      </w:pPr>
+      <w:r>
+        <w:rPr>
+          <w:rFonts w:ascii="Times New Roman" w:hAnsi="Times New Roman" w:cs="Times New Roman"/>
+          <w:sz w:val="22"/>
+          <w:szCs w:val="22"/>
+          <w:lang w:val="en-MY"/>
+        </w:rPr>
+        <w:t xml:space="preserve">        if (v, u) not in cap:</w:t>
+      </w:r>
+    </w:p>
+    <w:p>
+      <w:pPr>
+        <w:spacing w:after="0"/>
+        <w:rPr>
+          <w:rFonts w:ascii="Times New Roman" w:hAnsi="Times New Roman" w:cs="Times New Roman"/>
+          <w:sz w:val="22"/>
+          <w:szCs w:val="22"/>
+          <w:lang w:val="en-MY"/>
+        </w:rPr>
+      </w:pPr>
+      <w:r>
+        <w:rPr>
+          <w:rFonts w:ascii="Times New Roman" w:hAnsi="Times New Roman" w:cs="Times New Roman"/>
+          <w:sz w:val="22"/>
+          <w:szCs w:val="22"/>
+          <w:lang w:val="en-MY"/>
+        </w:rPr>
+        <w:t xml:space="preserve">            cap[v][u] ← 0</w:t>
+      </w:r>
+    </w:p>
+    <w:p>
+      <w:pPr>
+        <w:spacing w:after="0"/>
+        <w:rPr>
+          <w:rFonts w:ascii="Times New Roman" w:hAnsi="Times New Roman" w:cs="Times New Roman"/>
+          <w:sz w:val="22"/>
+          <w:szCs w:val="22"/>
+          <w:lang w:val="en-MY"/>
+        </w:rPr>
+      </w:pPr>
+      <w:r>
+        <w:rPr>
+          <w:rFonts w:ascii="Times New Roman" w:hAnsi="Times New Roman" w:cs="Times New Roman"/>
+          <w:sz w:val="22"/>
+          <w:szCs w:val="22"/>
+          <w:lang w:val="en-MY"/>
+        </w:rPr>
+        <w:t xml:space="preserve">    flow[u][v] ← 0 for every edge (u, v)</w:t>
+      </w:r>
+    </w:p>
+    <w:p>
+      <w:pPr>
+        <w:spacing w:after="0"/>
+        <w:rPr>
+          <w:rFonts w:ascii="Times New Roman" w:hAnsi="Times New Roman" w:cs="Times New Roman"/>
+          <w:sz w:val="22"/>
+          <w:szCs w:val="22"/>
+          <w:lang w:val="en-MY"/>
+        </w:rPr>
+      </w:pPr>
+      <w:r>
+        <w:rPr>
+          <w:rFonts w:ascii="Times New Roman" w:hAnsi="Times New Roman" w:cs="Times New Roman"/>
+          <w:sz w:val="22"/>
+          <w:szCs w:val="22"/>
+          <w:lang w:val="en-MY"/>
+        </w:rPr>
+        <w:t xml:space="preserve">    total ← 0</w:t>
+      </w:r>
+    </w:p>
+    <w:p>
+      <w:pPr>
+        <w:spacing w:after="0"/>
+        <w:rPr>
+          <w:rFonts w:ascii="Times New Roman" w:hAnsi="Times New Roman" w:cs="Times New Roman"/>
+          <w:sz w:val="22"/>
+          <w:szCs w:val="22"/>
+          <w:lang w:val="en-MY"/>
+        </w:rPr>
+      </w:pPr>
+    </w:p>
+    <w:p>
+      <w:pPr>
+        <w:spacing w:after="0"/>
+        <w:rPr>
+          <w:rFonts w:ascii="Times New Roman" w:hAnsi="Times New Roman" w:cs="Times New Roman"/>
+          <w:sz w:val="22"/>
+          <w:szCs w:val="22"/>
+          <w:lang w:val="en-MY"/>
+        </w:rPr>
+      </w:pPr>
+      <w:r>
+        <w:rPr>
+          <w:rFonts w:ascii="Times New Roman" w:hAnsi="Times New Roman" w:cs="Times New Roman"/>
+          <w:sz w:val="22"/>
+          <w:szCs w:val="22"/>
+          <w:lang w:val="en-MY"/>
+        </w:rPr>
+        <w:t xml:space="preserve">    loop:</w:t>
+      </w:r>
+    </w:p>
+    <w:p>
+      <w:pPr>
+        <w:spacing w:after="0"/>
+        <w:rPr>
+          <w:rFonts w:ascii="Times New Roman" w:hAnsi="Times New Roman" w:cs="Times New Roman"/>
+          <w:sz w:val="22"/>
+          <w:szCs w:val="22"/>
+          <w:lang w:val="en-MY"/>
+        </w:rPr>
+      </w:pPr>
+      <w:r>
+        <w:rPr>
+          <w:rFonts w:ascii="Times New Roman" w:hAnsi="Times New Roman" w:cs="Times New Roman"/>
+          <w:sz w:val="22"/>
+          <w:szCs w:val="22"/>
+          <w:lang w:val="en-MY"/>
+        </w:rPr>
+        <w:t xml:space="preserve">        path ← BFS_PATH(cap, flow, s, t)</w:t>
+      </w:r>
+    </w:p>
+    <w:p>
+      <w:pPr>
+        <w:spacing w:after="0"/>
+        <w:rPr>
+          <w:rFonts w:ascii="Times New Roman" w:hAnsi="Times New Roman" w:cs="Times New Roman"/>
+          <w:sz w:val="22"/>
+          <w:szCs w:val="22"/>
+          <w:lang w:val="en-MY"/>
+        </w:rPr>
+      </w:pPr>
+      <w:r>
+        <w:rPr>
+          <w:rFonts w:ascii="Times New Roman" w:hAnsi="Times New Roman" w:cs="Times New Roman"/>
+          <w:sz w:val="22"/>
+          <w:szCs w:val="22"/>
+          <w:lang w:val="en-MY"/>
+        </w:rPr>
+        <w:t xml:space="preserve">        if path = NONE:</w:t>
+      </w:r>
+    </w:p>
+    <w:p>
+      <w:pPr>
+        <w:spacing w:after="0"/>
+        <w:rPr>
+          <w:rFonts w:ascii="Times New Roman" w:hAnsi="Times New Roman" w:cs="Times New Roman"/>
+          <w:sz w:val="22"/>
+          <w:szCs w:val="22"/>
+          <w:lang w:val="en-MY"/>
+        </w:rPr>
+      </w:pPr>
+      <w:r>
+        <w:rPr>
+          <w:rFonts w:ascii="Times New Roman" w:hAnsi="Times New Roman" w:cs="Times New Roman"/>
+          <w:sz w:val="22"/>
+          <w:szCs w:val="22"/>
+          <w:lang w:val="en-MY"/>
+        </w:rPr>
+        <w:t xml:space="preserve">            return total                      // no augmenting path: flow is maximal</w:t>
+      </w:r>
+    </w:p>
+    <w:p>
+      <w:pPr>
+        <w:spacing w:after="0"/>
+        <w:rPr>
+          <w:rFonts w:ascii="Times New Roman" w:hAnsi="Times New Roman" w:cs="Times New Roman"/>
+          <w:sz w:val="22"/>
+          <w:szCs w:val="22"/>
+          <w:lang w:val="en-MY"/>
+        </w:rPr>
+      </w:pPr>
+      <w:r>
+        <w:rPr>
+          <w:rFonts w:ascii="Times New Roman" w:hAnsi="Times New Roman" w:cs="Times New Roman"/>
+          <w:sz w:val="22"/>
+          <w:szCs w:val="22"/>
+          <w:lang w:val="en-MY"/>
+        </w:rPr>
+        <w:t xml:space="preserve">        total ← total + AUGMENT(cap, flow, path)</w:t>
+      </w:r>
+    </w:p>
+    <w:p>
+      <w:pPr>
+        <w:spacing w:after="0"/>
+        <w:rPr>
+          <w:rFonts w:ascii="Times New Roman" w:hAnsi="Times New Roman" w:cs="Times New Roman"/>
+          <w:sz w:val="22"/>
+          <w:szCs w:val="22"/>
+          <w:lang w:val="en-MY"/>
+        </w:rPr>
+      </w:pPr>
+    </w:p>
+    <w:p>
+      <w:pPr>
+        <w:spacing w:after="0"/>
+        <w:rPr>
+          <w:rFonts w:ascii="Times New Roman" w:hAnsi="Times New Roman" w:cs="Times New Roman"/>
+          <w:sz w:val="22"/>
+          <w:szCs w:val="22"/>
+          <w:lang w:val="en-MY"/>
+        </w:rPr>
+      </w:pPr>
+    </w:p>
+    <w:p>
+      <w:pPr>
+        <w:spacing w:after="0"/>
+        <w:rPr>
+          <w:rFonts w:ascii="Times New Roman" w:hAnsi="Times New Roman" w:cs="Times New Roman"/>
+          <w:sz w:val="22"/>
+          <w:szCs w:val="22"/>
+          <w:lang w:val="en-MY"/>
+        </w:rPr>
+      </w:pPr>
+      <w:r>
+        <w:rPr>
+          <w:rFonts w:ascii="Times New Roman" w:hAnsi="Times New Roman" w:cs="Times New Roman"/>
+          <w:sz w:val="22"/>
+          <w:szCs w:val="22"/>
+          <w:lang w:val="en-MY"/>
+        </w:rPr>
+        <w:t>function BFS_PATH(cap, flow, s, t):</w:t>
+      </w:r>
+    </w:p>
+    <w:p>
+      <w:pPr>
+        <w:spacing w:after="0"/>
+        <w:rPr>
+          <w:rFonts w:ascii="Times New Roman" w:hAnsi="Times New Roman" w:cs="Times New Roman"/>
+          <w:sz w:val="22"/>
+          <w:szCs w:val="22"/>
+          <w:lang w:val="en-MY"/>
+        </w:rPr>
+      </w:pPr>
+      <w:r>
+        <w:rPr>
+          <w:rFonts w:ascii="Times New Roman" w:hAnsi="Times New Roman" w:cs="Times New Roman"/>
+          <w:sz w:val="22"/>
+          <w:szCs w:val="22"/>
+          <w:lang w:val="en-MY"/>
+        </w:rPr>
+        <w:t xml:space="preserve">    parent[s] ← s</w:t>
+      </w:r>
+    </w:p>
+    <w:p>
+      <w:pPr>
+        <w:spacing w:after="0"/>
+        <w:rPr>
+          <w:rFonts w:ascii="Times New Roman" w:hAnsi="Times New Roman" w:cs="Times New Roman"/>
+          <w:sz w:val="22"/>
+          <w:szCs w:val="22"/>
+          <w:lang w:val="en-MY"/>
+        </w:rPr>
+      </w:pPr>
+      <w:r>
+        <w:rPr>
+          <w:rFonts w:ascii="Times New Roman" w:hAnsi="Times New Roman" w:cs="Times New Roman"/>
+          <w:sz w:val="22"/>
+          <w:szCs w:val="22"/>
+          <w:lang w:val="en-MY"/>
+        </w:rPr>
+        <w:lastRenderedPageBreak/>
+        <w:t xml:space="preserve">    queue ← [s]</w:t>
+      </w:r>
+    </w:p>
+    <w:p>
+      <w:pPr>
+        <w:spacing w:after="0"/>
+        <w:rPr>
+          <w:rFonts w:ascii="Times New Roman" w:hAnsi="Times New Roman" w:cs="Times New Roman"/>
+          <w:sz w:val="22"/>
+          <w:szCs w:val="22"/>
+          <w:lang w:val="en-MY"/>
+        </w:rPr>
+      </w:pPr>
+      <w:r>
+        <w:rPr>
+          <w:rFonts w:ascii="Times New Roman" w:hAnsi="Times New Roman" w:cs="Times New Roman"/>
+          <w:sz w:val="22"/>
+          <w:szCs w:val="22"/>
+          <w:lang w:val="en-MY"/>
+        </w:rPr>
+        <w:t xml:space="preserve">    while queue is not empty:</w:t>
+      </w:r>
+    </w:p>
+    <w:p>
+      <w:pPr>
+        <w:spacing w:after="0"/>
+        <w:rPr>
+          <w:rFonts w:ascii="Times New Roman" w:hAnsi="Times New Roman" w:cs="Times New Roman"/>
+          <w:sz w:val="22"/>
+          <w:szCs w:val="22"/>
+          <w:lang w:val="en-MY"/>
+        </w:rPr>
+      </w:pPr>
+      <w:r>
+        <w:rPr>
+          <w:rFonts w:ascii="Times New Roman" w:hAnsi="Times New Roman" w:cs="Times New Roman"/>
+          <w:sz w:val="22"/>
+          <w:szCs w:val="22"/>
+          <w:lang w:val="en-MY"/>
+        </w:rPr>
+        <w:t xml:space="preserve">        u ← dequeue(queue)</w:t>
+      </w:r>
+    </w:p>
+    <w:p>
+      <w:pPr>
+        <w:spacing w:after="0"/>
+        <w:rPr>
+          <w:rFonts w:ascii="Times New Roman" w:hAnsi="Times New Roman" w:cs="Times New Roman"/>
+          <w:sz w:val="22"/>
+          <w:szCs w:val="22"/>
+          <w:lang w:val="en-MY"/>
+        </w:rPr>
+      </w:pPr>
+      <w:r>
+        <w:rPr>
+          <w:rFonts w:ascii="Times New Roman" w:hAnsi="Times New Roman" w:cs="Times New Roman"/>
+          <w:sz w:val="22"/>
+          <w:szCs w:val="22"/>
+          <w:lang w:val="en-MY"/>
+        </w:rPr>
+        <w:t xml:space="preserve">        for each neighbour v of u:</w:t>
+      </w:r>
+    </w:p>
+    <w:p>
+      <w:pPr>
+        <w:spacing w:after="0"/>
+        <w:rPr>
+          <w:rFonts w:ascii="Times New Roman" w:hAnsi="Times New Roman" w:cs="Times New Roman"/>
+          <w:sz w:val="22"/>
+          <w:szCs w:val="22"/>
+          <w:lang w:val="en-MY"/>
+        </w:rPr>
+      </w:pPr>
+      <w:r>
+        <w:rPr>
+          <w:rFonts w:ascii="Times New Roman" w:hAnsi="Times New Roman" w:cs="Times New Roman"/>
+          <w:sz w:val="22"/>
+          <w:szCs w:val="22"/>
+          <w:lang w:val="en-MY"/>
+        </w:rPr>
+        <w:t xml:space="preserve">            if v has no parent and flow[u][v] &lt; cap[u][v]:   // edge has spare capacity</w:t>
+      </w:r>
+    </w:p>
+    <w:p>
+      <w:pPr>
+        <w:spacing w:after="0"/>
+        <w:rPr>
+          <w:rFonts w:ascii="Times New Roman" w:hAnsi="Times New Roman" w:cs="Times New Roman"/>
+          <w:sz w:val="22"/>
+          <w:szCs w:val="22"/>
+          <w:lang w:val="en-MY"/>
+        </w:rPr>
+      </w:pPr>
+      <w:r>
+        <w:rPr>
+          <w:rFonts w:ascii="Times New Roman" w:hAnsi="Times New Roman" w:cs="Times New Roman"/>
+          <w:sz w:val="22"/>
+          <w:szCs w:val="22"/>
+          <w:lang w:val="en-MY"/>
+        </w:rPr>
+        <w:t xml:space="preserve">                parent[v] ← u</w:t>
+      </w:r>
+    </w:p>
+    <w:p>
+      <w:pPr>
+        <w:spacing w:after="0"/>
+        <w:rPr>
+          <w:rFonts w:ascii="Times New Roman" w:hAnsi="Times New Roman" w:cs="Times New Roman"/>
+          <w:sz w:val="22"/>
+          <w:szCs w:val="22"/>
+          <w:lang w:val="en-MY"/>
+        </w:rPr>
+      </w:pPr>
+      <w:r>
+        <w:rPr>
+          <w:rFonts w:ascii="Times New Roman" w:hAnsi="Times New Roman" w:cs="Times New Roman"/>
+          <w:sz w:val="22"/>
+          <w:szCs w:val="22"/>
+          <w:lang w:val="en-MY"/>
+        </w:rPr>
+        <w:t xml:space="preserve">                enqueue(queue, v)</w:t>
+      </w:r>
+    </w:p>
+    <w:p>
+      <w:pPr>
+        <w:spacing w:after="0"/>
+        <w:rPr>
+          <w:rFonts w:ascii="Times New Roman" w:hAnsi="Times New Roman" w:cs="Times New Roman"/>
+          <w:sz w:val="22"/>
+          <w:szCs w:val="22"/>
+          <w:lang w:val="en-MY"/>
+        </w:rPr>
+      </w:pPr>
+      <w:r>
+        <w:rPr>
+          <w:rFonts w:ascii="Times New Roman" w:hAnsi="Times New Roman" w:cs="Times New Roman"/>
+          <w:sz w:val="22"/>
+          <w:szCs w:val="22"/>
+          <w:lang w:val="en-MY"/>
+        </w:rPr>
+        <w:t xml:space="preserve">    if </w:t>
+      </w:r>
+      <w:proofErr w:type="spellStart"/>
+      <w:r>
+        <w:rPr>
+          <w:rFonts w:ascii="Times New Roman" w:hAnsi="Times New Roman" w:cs="Times New Roman"/>
+          <w:sz w:val="22"/>
+          <w:szCs w:val="22"/>
+          <w:lang w:val="en-MY"/>
+        </w:rPr>
+        <w:t>t</w:t>
+      </w:r>
+      <w:proofErr w:type="spellEnd"/>
+      <w:r>
+        <w:rPr>
+          <w:rFonts w:ascii="Times New Roman" w:hAnsi="Times New Roman" w:cs="Times New Roman"/>
+          <w:sz w:val="22"/>
+          <w:szCs w:val="22"/>
+          <w:lang w:val="en-MY"/>
+        </w:rPr>
+        <w:t xml:space="preserve"> has no parent:</w:t>
+      </w:r>
+    </w:p>
+    <w:p>
+      <w:pPr>
+        <w:spacing w:after="0"/>
+        <w:rPr>
+          <w:rFonts w:ascii="Times New Roman" w:hAnsi="Times New Roman" w:cs="Times New Roman"/>
+          <w:sz w:val="22"/>
+          <w:szCs w:val="22"/>
+          <w:lang w:val="en-MY"/>
+        </w:rPr>
+      </w:pPr>
+      <w:r>
+        <w:rPr>
+          <w:rFonts w:ascii="Times New Roman" w:hAnsi="Times New Roman" w:cs="Times New Roman"/>
+          <w:sz w:val="22"/>
+          <w:szCs w:val="22"/>
+          <w:lang w:val="en-MY"/>
+        </w:rPr>
+        <w:t xml:space="preserve">        return NONE</w:t>
+      </w:r>
+    </w:p>
+    <w:p>
+      <w:pPr>
+        <w:spacing w:after="0"/>
+        <w:rPr>
+          <w:rFonts w:ascii="Times New Roman" w:hAnsi="Times New Roman" w:cs="Times New Roman"/>
+          <w:sz w:val="22"/>
+          <w:szCs w:val="22"/>
+          <w:lang w:val="en-MY"/>
+        </w:rPr>
+      </w:pPr>
+      <w:r>
+        <w:rPr>
+          <w:rFonts w:ascii="Times New Roman" w:hAnsi="Times New Roman" w:cs="Times New Roman"/>
+          <w:sz w:val="22"/>
+          <w:szCs w:val="22"/>
+          <w:lang w:val="en-MY"/>
+        </w:rPr>
+        <w:t xml:space="preserve">    return path from s to t, rebuilt by following parent links back from t</w:t>
+      </w:r>
+    </w:p>
+    <w:p>
+      <w:pPr>
+        <w:spacing w:after="0"/>
+        <w:rPr>
+          <w:rFonts w:ascii="Times New Roman" w:hAnsi="Times New Roman" w:cs="Times New Roman"/>
+          <w:sz w:val="22"/>
+          <w:szCs w:val="22"/>
+          <w:lang w:val="en-MY"/>
+        </w:rPr>
+      </w:pPr>
+    </w:p>
+    <w:p>
+      <w:pPr>
+        <w:spacing w:after="0"/>
+        <w:rPr>
+          <w:rFonts w:ascii="Times New Roman" w:hAnsi="Times New Roman" w:cs="Times New Roman"/>
+          <w:sz w:val="22"/>
+          <w:szCs w:val="22"/>
+          <w:lang w:val="en-MY"/>
+        </w:rPr>
+      </w:pPr>
+    </w:p>
+    <w:p>
+      <w:pPr>
+        <w:spacing w:after="0"/>
+        <w:rPr>
+          <w:rFonts w:ascii="Times New Roman" w:hAnsi="Times New Roman" w:cs="Times New Roman"/>
+          <w:sz w:val="22"/>
+          <w:szCs w:val="22"/>
+          <w:lang w:val="en-MY"/>
+        </w:rPr>
+      </w:pPr>
+      <w:r>
+        <w:rPr>
+          <w:rFonts w:ascii="Times New Roman" w:hAnsi="Times New Roman" w:cs="Times New Roman"/>
+          <w:sz w:val="22"/>
+          <w:szCs w:val="22"/>
+          <w:lang w:val="en-MY"/>
+        </w:rPr>
+        <w:t>function AUGMENT(cap, flow, path):</w:t>
+      </w:r>
+    </w:p>
+    <w:p>
+      <w:pPr>
+        <w:spacing w:after="0"/>
+        <w:rPr>
+          <w:rFonts w:ascii="Times New Roman" w:hAnsi="Times New Roman" w:cs="Times New Roman"/>
+          <w:sz w:val="22"/>
+          <w:szCs w:val="22"/>
+          <w:lang w:val="en-MY"/>
+        </w:rPr>
+      </w:pPr>
+      <w:r>
+        <w:rPr>
+          <w:rFonts w:ascii="Times New Roman" w:hAnsi="Times New Roman" w:cs="Times New Roman"/>
+          <w:sz w:val="22"/>
+          <w:szCs w:val="22"/>
+          <w:lang w:val="en-MY"/>
+        </w:rPr>
+        <w:t xml:space="preserve">    bottleneck ← min over edges (u, v) in path of (cap[u][v] − flow[u][v])</w:t>
+      </w:r>
+    </w:p>
+    <w:p>
+      <w:pPr>
+        <w:spacing w:after="0"/>
+        <w:rPr>
+          <w:rFonts w:ascii="Times New Roman" w:hAnsi="Times New Roman" w:cs="Times New Roman"/>
+          <w:sz w:val="22"/>
+          <w:szCs w:val="22"/>
+          <w:lang w:val="en-MY"/>
+        </w:rPr>
+      </w:pPr>
+      <w:r>
+        <w:rPr>
+          <w:rFonts w:ascii="Times New Roman" w:hAnsi="Times New Roman" w:cs="Times New Roman"/>
+          <w:sz w:val="22"/>
+          <w:szCs w:val="22"/>
+          <w:lang w:val="en-MY"/>
+        </w:rPr>
+        <w:t xml:space="preserve">    for each edge (u, v) in path:</w:t>
+      </w:r>
+    </w:p>
+    <w:p>
+      <w:pPr>
+        <w:spacing w:after="0"/>
+        <w:rPr>
+          <w:rFonts w:ascii="Times New Roman" w:hAnsi="Times New Roman" w:cs="Times New Roman"/>
+          <w:sz w:val="22"/>
+          <w:szCs w:val="22"/>
+          <w:lang w:val="en-MY"/>
+        </w:rPr>
+      </w:pPr>
+      <w:r>
+        <w:rPr>
+          <w:rFonts w:ascii="Times New Roman" w:hAnsi="Times New Roman" w:cs="Times New Roman"/>
+          <w:sz w:val="22"/>
+          <w:szCs w:val="22"/>
+          <w:lang w:val="en-MY"/>
+        </w:rPr>
+        <w:t xml:space="preserve">        flow[u][v] ← flow[u][v] + bottleneck</w:t>
+      </w:r>
+    </w:p>
+    <w:p>
+      <w:pPr>
+        <w:spacing w:after="0"/>
+        <w:rPr>
+          <w:rFonts w:ascii="Times New Roman" w:hAnsi="Times New Roman" w:cs="Times New Roman"/>
+          <w:sz w:val="22"/>
+          <w:szCs w:val="22"/>
+          <w:lang w:val="en-MY"/>
+        </w:rPr>
+      </w:pPr>
+      <w:r>
+        <w:rPr>
+          <w:rFonts w:ascii="Times New Roman" w:hAnsi="Times New Roman" w:cs="Times New Roman"/>
+          <w:sz w:val="22"/>
+          <w:szCs w:val="22"/>
+          <w:lang w:val="en-MY"/>
+        </w:rPr>
+        <w:t xml:space="preserve">        flow[v][u] ← flow[v][u] − bottleneck  // allows this flow to be undone later</w:t>
+      </w:r>
+    </w:p>
+    <w:p>
+      <w:pPr>
+        <w:spacing w:after="0"/>
+        <w:rPr>
+          <w:rFonts w:ascii="Times New Roman" w:hAnsi="Times New Roman" w:cs="Times New Roman"/>
+          <w:sz w:val="22"/>
+          <w:szCs w:val="22"/>
+          <w:lang w:val="en-MY"/>
+        </w:rPr>
+      </w:pPr>
+      <w:r>
+        <w:rPr>
+          <w:rFonts w:ascii="Times New Roman" w:hAnsi="Times New Roman" w:cs="Times New Roman"/>
+          <w:sz w:val="22"/>
+          <w:szCs w:val="22"/>
+          <w:lang w:val="en-MY"/>
+        </w:rPr>
+        <w:t xml:space="preserve">    return bottleneck</w:t>
+      </w:r>
+    </w:p>
+    <w:p>
+      <w:pPr>
+        <w:spacing w:after="0"/>
+        <w:rPr>
+          <w:rFonts w:ascii="Times New Roman" w:hAnsi="Times New Roman" w:cs="Times New Roman"/>
+          <w:sz w:val="22"/>
+          <w:szCs w:val="22"/>
+          <w:lang w:val="en-MY"/>
+        </w:rPr>
+      </w:pPr>
+    </w:p>
+    <w:p>
+      <w:pPr>
+        <w:spacing w:after="0"/>
+        <w:rPr>
+          <w:rFonts w:ascii="Times New Roman" w:hAnsi="Times New Roman" w:cs="Times New Roman"/>
+          <w:sz w:val="22"/>
+          <w:szCs w:val="22"/>
+          <w:lang w:val="en-MY"/>
+        </w:rPr>
+      </w:pPr>
+    </w:p>
+    <w:p>
+      <w:pPr>
+        <w:spacing w:after="0"/>
+        <w:rPr>
+          <w:rFonts w:ascii="Times New Roman" w:hAnsi="Times New Roman" w:cs="Times New Roman"/>
+          <w:sz w:val="22"/>
+          <w:szCs w:val="22"/>
+          <w:lang w:val="en-MY"/>
+        </w:rPr>
+      </w:pPr>
+      <w:r>
+        <w:rPr>
+          <w:rFonts w:ascii="Times New Roman" w:hAnsi="Times New Roman" w:cs="Times New Roman"/>
+          <w:sz w:val="22"/>
+          <w:szCs w:val="22"/>
+          <w:lang w:val="en-MY"/>
+        </w:rPr>
+        <w:t>main:</w:t>
+      </w:r>
+    </w:p>
+    <w:p>
+      <w:pPr>
+        <w:spacing w:after="0"/>
+        <w:rPr>
+          <w:rFonts w:ascii="Times New Roman" w:hAnsi="Times New Roman" w:cs="Times New Roman"/>
+          <w:sz w:val="22"/>
+          <w:szCs w:val="22"/>
+          <w:lang w:val="en-MY"/>
+        </w:rPr>
+      </w:pPr>
+      <w:r>
+        <w:rPr>
+          <w:rFonts w:ascii="Times New Roman" w:hAnsi="Times New Roman" w:cs="Times New Roman"/>
+          <w:sz w:val="22"/>
+          <w:szCs w:val="22"/>
+          <w:lang w:val="en-MY"/>
+        </w:rPr>
+        <w:t xml:space="preserve">    read T, S, R</w:t>
+      </w:r>
+    </w:p>
+    <w:p>
+      <w:pPr>
+        <w:spacing w:after="0"/>
+        <w:rPr>
+          <w:rFonts w:ascii="Times New Roman" w:hAnsi="Times New Roman" w:cs="Times New Roman"/>
+          <w:sz w:val="22"/>
+          <w:szCs w:val="22"/>
+          <w:lang w:val="en-MY"/>
+        </w:rPr>
+      </w:pPr>
+      <w:r>
+        <w:rPr>
+          <w:rFonts w:ascii="Times New Roman" w:hAnsi="Times New Roman" w:cs="Times New Roman"/>
+          <w:sz w:val="22"/>
+          <w:szCs w:val="22"/>
+          <w:lang w:val="en-MY"/>
+        </w:rPr>
+        <w:t xml:space="preserve">    read p[1..T], c[1..S]</w:t>
+      </w:r>
+    </w:p>
+    <w:p>
+      <w:pPr>
+        <w:spacing w:after="0"/>
+        <w:rPr>
+          <w:rFonts w:ascii="Times New Roman" w:hAnsi="Times New Roman" w:cs="Times New Roman"/>
+          <w:sz w:val="22"/>
+          <w:szCs w:val="22"/>
+          <w:lang w:val="en-MY"/>
+        </w:rPr>
+      </w:pPr>
+      <w:r>
+        <w:rPr>
+          <w:rFonts w:ascii="Times New Roman" w:hAnsi="Times New Roman" w:cs="Times New Roman"/>
+          <w:sz w:val="22"/>
+          <w:szCs w:val="22"/>
+          <w:lang w:val="en-MY"/>
+        </w:rPr>
+        <w:t xml:space="preserve">    read R roads (u, v, w)</w:t>
+      </w:r>
+    </w:p>
+    <w:p>
+      <w:pPr>
+        <w:spacing w:after="0"/>
+        <w:rPr>
+          <w:rFonts w:ascii="Times New Roman" w:hAnsi="Times New Roman" w:cs="Times New Roman"/>
+          <w:sz w:val="22"/>
+          <w:szCs w:val="22"/>
+          <w:lang w:val="en-MY"/>
+        </w:rPr>
+      </w:pPr>
+      <w:r>
+        <w:rPr>
+          <w:rFonts w:ascii="Times New Roman" w:hAnsi="Times New Roman" w:cs="Times New Roman"/>
+          <w:sz w:val="22"/>
+          <w:szCs w:val="22"/>
+          <w:lang w:val="en-MY"/>
+        </w:rPr>
+        <w:t xml:space="preserve">    print MAX_EVACUATED(T, S, p, c, roads)</w:t>
+      </w:r>
+    </w:p>
+    <w:p>
+      <w:pPr>
+        <w:spacing w:after="0"/>
+        <w:rPr>
+          <w:rFonts w:ascii="Times New Roman" w:hAnsi="Times New Roman" w:cs="Times New Roman"/>
           <w:b/>
           <w:bCs/>
           <w:sz w:val="22"/>
@@ -1395,7 +2556,17 @@
           <w:szCs w:val="22"/>
           <w:lang w:val="en-MY"/>
         </w:rPr>
-        <w:t>Augmenting by one person at a time rather than by the full bottleneck. This approach always produces the correct answer, but requires one iteration per person evacuated. With capacities up to 10⁹, it performs on the order of 10⁸ to 10⁹ iterations and exceeds the time limit, whereas the bottleneck-based approach requires only a handful of iterations on the same input.</w:t>
+        <w:t xml:space="preserve">Augmenting by one person at a time rather than by the full bottleneck. This approach always produces the correct answer, but requires one iteration per person evacuated. With capacities </w:t>
+      </w:r>
+      <w:r>
+        <w:rPr>
+          <w:rFonts w:ascii="Times New Roman" w:hAnsi="Times New Roman" w:cs="Times New Roman"/>
+          <w:sz w:val="22"/>
+          <w:szCs w:val="22"/>
+          <w:lang w:val="en-MY"/>
+        </w:rPr>
+        <w:lastRenderedPageBreak/>
+        <w:t>up to 10⁹, it performs on the order of 10⁸ to 10⁹ iterations and exceeds the time limit, whereas the bottleneck-based approach requires only a handful of iterations on the same input.</w:t>
       </w:r>
     </w:p>
     <w:p>

</xml_diff>

<commit_message>
added comments for explanation
</commit_message>
<xml_diff>
--- a/problems/wildfireevacuation/WildfireEvacuation_Editorial_24849627.docx
+++ b/problems/wildfireevacuation/WildfireEvacuation_Editorial_24849627.docx
@@ -102,7 +102,43 @@
           <w:szCs w:val="22"/>
           <w:lang w:val="en-MY"/>
         </w:rPr>
-        <w:t xml:space="preserve"> as a maximum flow problem, represented as a directed graph where the road network constitutes the edges, and people represent the flow from towns to shelters. The solution consolidates the towns and shelters into a single source and sink, utilizing the Edmonds–Karp algorithm, a breadth-first approach to the Ford–Fulkerson method.</w:t>
+        <w:t xml:space="preserve"> as a maximum flow problem, represented as a directed graph where the road network constitutes the edges, and people represent the flow from towns to shelters. The solution consolidates the towns and shelters into a single source and sink, utilizing the Edmonds</w:t>
+      </w:r>
+      <w:r>
+        <w:rPr>
+          <w:rFonts w:ascii="Times New Roman" w:hAnsi="Times New Roman" w:cs="Times New Roman"/>
+          <w:sz w:val="22"/>
+          <w:szCs w:val="22"/>
+          <w:lang w:val="en-MY"/>
+        </w:rPr>
+        <w:t xml:space="preserve"> </w:t>
+      </w:r>
+      <w:r>
+        <w:rPr>
+          <w:rFonts w:ascii="Times New Roman" w:hAnsi="Times New Roman" w:cs="Times New Roman"/>
+          <w:sz w:val="22"/>
+          <w:szCs w:val="22"/>
+          <w:lang w:val="en-MY"/>
+        </w:rPr>
+        <w:t>Karp algorithm, a breadth-first approach to the Ford</w:t>
+      </w:r>
+      <w:r>
+        <w:rPr>
+          <w:rFonts w:ascii="Times New Roman" w:hAnsi="Times New Roman" w:cs="Times New Roman"/>
+          <w:sz w:val="22"/>
+          <w:szCs w:val="22"/>
+          <w:lang w:val="en-MY"/>
+        </w:rPr>
+        <w:t xml:space="preserve"> </w:t>
+      </w:r>
+      <w:r>
+        <w:rPr>
+          <w:rFonts w:ascii="Times New Roman" w:hAnsi="Times New Roman" w:cs="Times New Roman"/>
+          <w:sz w:val="22"/>
+          <w:szCs w:val="22"/>
+          <w:lang w:val="en-MY"/>
+        </w:rPr>
+        <w:t>Fulkerson method.</w:t>
       </w:r>
       <w:r>
         <w:rPr>
@@ -672,15 +708,6 @@
           <w:szCs w:val="22"/>
           <w:lang w:val="en-MY"/>
         </w:rPr>
-        <w:t xml:space="preserve"> </w:t>
-      </w:r>
-      <w:r>
-        <w:rPr>
-          <w:rFonts w:ascii="Times New Roman" w:hAnsi="Times New Roman" w:cs="Times New Roman"/>
-          <w:sz w:val="22"/>
-          <w:szCs w:val="22"/>
-          <w:lang w:val="en-MY"/>
-        </w:rPr>
         <w:t xml:space="preserve">The space complexity is </w:t>
       </w:r>
       <w:r>
@@ -690,7 +717,25 @@
           <w:szCs w:val="22"/>
           <w:lang w:val="en-MY"/>
         </w:rPr>
-        <w:t>O(V + E). The network is stored as an adjacency map recording, for each edge and its reverse, a capacity and a current flow. The breadth-first search additionally maintains a queue and a parent map, each of size O(V). No structure grows with the magnitude of the capacities.</w:t>
+        <w:t xml:space="preserve">O(V + E). The network is stored as an adjacency map recording, for each edge and its reverse, a capacity and a current flow. The </w:t>
+      </w:r>
+      <w:r>
+        <w:rPr>
+          <w:rFonts w:ascii="Times New Roman" w:hAnsi="Times New Roman" w:cs="Times New Roman"/>
+          <w:sz w:val="22"/>
+          <w:szCs w:val="22"/>
+          <w:lang w:val="en-MY"/>
+        </w:rPr>
+        <w:t>BFS</w:t>
+      </w:r>
+      <w:r>
+        <w:rPr>
+          <w:rFonts w:ascii="Times New Roman" w:hAnsi="Times New Roman" w:cs="Times New Roman"/>
+          <w:sz w:val="22"/>
+          <w:szCs w:val="22"/>
+          <w:lang w:val="en-MY"/>
+        </w:rPr>
+        <w:t xml:space="preserve"> additionally maintains a queue and a parent map, each of size O(V). No structure grows with the magnitude of the capacities.</w:t>
       </w:r>
     </w:p>
     <w:p>
@@ -1053,31 +1098,7 @@
           <w:lang w:val="en-MY"/>
         </w:rPr>
         <w:lastRenderedPageBreak/>
-        <w:t xml:space="preserve">The </w:t>
-      </w:r>
-      <w:proofErr w:type="spellStart"/>
-      <w:r>
-        <w:rPr>
-          <w:rFonts w:ascii="Times New Roman" w:hAnsi="Times New Roman" w:cs="Times New Roman"/>
-          <w:b/>
-          <w:bCs/>
-          <w:sz w:val="22"/>
-          <w:szCs w:val="22"/>
-          <w:lang w:val="en-MY"/>
-        </w:rPr>
-        <w:t>EdmondsKarp</w:t>
-      </w:r>
-      <w:proofErr w:type="spellEnd"/>
-      <w:r>
-        <w:rPr>
-          <w:rFonts w:ascii="Times New Roman" w:hAnsi="Times New Roman" w:cs="Times New Roman"/>
-          <w:b/>
-          <w:bCs/>
-          <w:sz w:val="22"/>
-          <w:szCs w:val="22"/>
-          <w:lang w:val="en-MY"/>
-        </w:rPr>
-        <w:t xml:space="preserve"> algorithm</w:t>
+        <w:t>The EdmondsKarp algorithm</w:t>
       </w:r>
     </w:p>
     <w:p>
@@ -1238,1091 +1259,167 @@
           <w:szCs w:val="22"/>
           <w:lang w:val="en-MY"/>
         </w:rPr>
-        <w:t>function MAX_EVACUATED(T, S, p, c, roads):</w:t>
-      </w:r>
-    </w:p>
-    <w:p>
-      <w:pPr>
-        <w:spacing w:after="0"/>
-        <w:rPr>
-          <w:rFonts w:ascii="Times New Roman" w:hAnsi="Times New Roman" w:cs="Times New Roman"/>
-          <w:sz w:val="22"/>
-          <w:szCs w:val="22"/>
-          <w:lang w:val="en-MY"/>
-        </w:rPr>
-      </w:pPr>
-      <w:r>
-        <w:rPr>
-          <w:rFonts w:ascii="Times New Roman" w:hAnsi="Times New Roman" w:cs="Times New Roman"/>
-          <w:sz w:val="22"/>
-          <w:szCs w:val="22"/>
-          <w:lang w:val="en-MY"/>
-        </w:rPr>
-        <w:t xml:space="preserve">    SOURCE ← 0</w:t>
-      </w:r>
-    </w:p>
-    <w:p>
-      <w:pPr>
-        <w:spacing w:after="0"/>
-        <w:rPr>
-          <w:rFonts w:ascii="Times New Roman" w:hAnsi="Times New Roman" w:cs="Times New Roman"/>
-          <w:sz w:val="22"/>
-          <w:szCs w:val="22"/>
-          <w:lang w:val="en-MY"/>
-        </w:rPr>
-      </w:pPr>
-      <w:r>
-        <w:rPr>
-          <w:rFonts w:ascii="Times New Roman" w:hAnsi="Times New Roman" w:cs="Times New Roman"/>
-          <w:sz w:val="22"/>
-          <w:szCs w:val="22"/>
-          <w:lang w:val="en-MY"/>
-        </w:rPr>
-        <w:t xml:space="preserve">    SINK   ← T + S + 1</w:t>
-      </w:r>
-    </w:p>
-    <w:p>
-      <w:pPr>
-        <w:spacing w:after="0"/>
-        <w:rPr>
-          <w:rFonts w:ascii="Times New Roman" w:hAnsi="Times New Roman" w:cs="Times New Roman"/>
-          <w:sz w:val="22"/>
-          <w:szCs w:val="22"/>
-          <w:lang w:val="en-MY"/>
-        </w:rPr>
-      </w:pPr>
-      <w:r>
-        <w:rPr>
-          <w:rFonts w:ascii="Times New Roman" w:hAnsi="Times New Roman" w:cs="Times New Roman"/>
-          <w:sz w:val="22"/>
-          <w:szCs w:val="22"/>
-          <w:lang w:val="en-MY"/>
-        </w:rPr>
-        <w:t xml:space="preserve">    cap    ← empty map                        // cap[u][v] = capacity of edge u → v</w:t>
-      </w:r>
-    </w:p>
-    <w:p>
-      <w:pPr>
-        <w:spacing w:after="0"/>
-        <w:rPr>
-          <w:rFonts w:ascii="Times New Roman" w:hAnsi="Times New Roman" w:cs="Times New Roman"/>
-          <w:sz w:val="22"/>
-          <w:szCs w:val="22"/>
-          <w:lang w:val="en-MY"/>
-        </w:rPr>
-      </w:pPr>
-    </w:p>
-    <w:p>
-      <w:pPr>
-        <w:spacing w:after="0"/>
-        <w:rPr>
-          <w:rFonts w:ascii="Times New Roman" w:hAnsi="Times New Roman" w:cs="Times New Roman"/>
-          <w:sz w:val="22"/>
-          <w:szCs w:val="22"/>
-          <w:lang w:val="en-MY"/>
-        </w:rPr>
-      </w:pPr>
-      <w:r>
-        <w:rPr>
-          <w:rFonts w:ascii="Times New Roman" w:hAnsi="Times New Roman" w:cs="Times New Roman"/>
-          <w:sz w:val="22"/>
-          <w:szCs w:val="22"/>
-          <w:lang w:val="en-MY"/>
-        </w:rPr>
-        <w:t xml:space="preserve">    for i ← 1 to T:                           // super-source → each town</w:t>
-      </w:r>
-    </w:p>
-    <w:p>
-      <w:pPr>
-        <w:spacing w:after="0"/>
-        <w:rPr>
-          <w:rFonts w:ascii="Times New Roman" w:hAnsi="Times New Roman" w:cs="Times New Roman"/>
-          <w:sz w:val="22"/>
-          <w:szCs w:val="22"/>
-          <w:lang w:val="en-MY"/>
-        </w:rPr>
-      </w:pPr>
-      <w:r>
-        <w:rPr>
-          <w:rFonts w:ascii="Times New Roman" w:hAnsi="Times New Roman" w:cs="Times New Roman"/>
-          <w:sz w:val="22"/>
-          <w:szCs w:val="22"/>
-          <w:lang w:val="en-MY"/>
-        </w:rPr>
-        <w:t xml:space="preserve">        ADD_EDGE(SOURCE, i, p[i])</w:t>
-      </w:r>
-    </w:p>
-    <w:p>
-      <w:pPr>
-        <w:spacing w:after="0"/>
-        <w:rPr>
-          <w:rFonts w:ascii="Times New Roman" w:hAnsi="Times New Roman" w:cs="Times New Roman"/>
-          <w:sz w:val="22"/>
-          <w:szCs w:val="22"/>
-          <w:lang w:val="en-MY"/>
-        </w:rPr>
-      </w:pPr>
-      <w:r>
-        <w:rPr>
-          <w:rFonts w:ascii="Times New Roman" w:hAnsi="Times New Roman" w:cs="Times New Roman"/>
-          <w:sz w:val="22"/>
-          <w:szCs w:val="22"/>
-          <w:lang w:val="en-MY"/>
-        </w:rPr>
-        <w:t xml:space="preserve">    for j ← 1 to S:                           // each shelter → super-sink</w:t>
-      </w:r>
-    </w:p>
-    <w:p>
-      <w:pPr>
-        <w:spacing w:after="0"/>
-        <w:rPr>
-          <w:rFonts w:ascii="Times New Roman" w:hAnsi="Times New Roman" w:cs="Times New Roman"/>
-          <w:sz w:val="22"/>
-          <w:szCs w:val="22"/>
-          <w:lang w:val="en-MY"/>
-        </w:rPr>
-      </w:pPr>
-      <w:r>
-        <w:rPr>
-          <w:rFonts w:ascii="Times New Roman" w:hAnsi="Times New Roman" w:cs="Times New Roman"/>
-          <w:sz w:val="22"/>
-          <w:szCs w:val="22"/>
-          <w:lang w:val="en-MY"/>
-        </w:rPr>
-        <w:t xml:space="preserve">        ADD_EDGE(T + j, SINK, c[j])</w:t>
-      </w:r>
-    </w:p>
-    <w:p>
-      <w:pPr>
-        <w:spacing w:after="0"/>
-        <w:rPr>
-          <w:rFonts w:ascii="Times New Roman" w:hAnsi="Times New Roman" w:cs="Times New Roman"/>
-          <w:sz w:val="22"/>
-          <w:szCs w:val="22"/>
-          <w:lang w:val="en-MY"/>
-        </w:rPr>
-      </w:pPr>
-      <w:r>
-        <w:rPr>
-          <w:rFonts w:ascii="Times New Roman" w:hAnsi="Times New Roman" w:cs="Times New Roman"/>
-          <w:sz w:val="22"/>
-          <w:szCs w:val="22"/>
-          <w:lang w:val="en-MY"/>
-        </w:rPr>
-        <w:t xml:space="preserve">    for each road (u, v, w) in roads:         // one-way roads</w:t>
-      </w:r>
-    </w:p>
-    <w:p>
-      <w:pPr>
-        <w:spacing w:after="0"/>
-        <w:rPr>
-          <w:rFonts w:ascii="Times New Roman" w:hAnsi="Times New Roman" w:cs="Times New Roman"/>
-          <w:sz w:val="22"/>
-          <w:szCs w:val="22"/>
-          <w:lang w:val="en-MY"/>
-        </w:rPr>
-      </w:pPr>
-      <w:r>
-        <w:rPr>
-          <w:rFonts w:ascii="Times New Roman" w:hAnsi="Times New Roman" w:cs="Times New Roman"/>
-          <w:sz w:val="22"/>
-          <w:szCs w:val="22"/>
-          <w:lang w:val="en-MY"/>
-        </w:rPr>
-        <w:t xml:space="preserve">        ADD_EDGE(u, v, w)</w:t>
-      </w:r>
-    </w:p>
-    <w:p>
-      <w:pPr>
-        <w:spacing w:after="0"/>
-        <w:rPr>
-          <w:rFonts w:ascii="Times New Roman" w:hAnsi="Times New Roman" w:cs="Times New Roman"/>
-          <w:sz w:val="22"/>
-          <w:szCs w:val="22"/>
-          <w:lang w:val="en-MY"/>
-        </w:rPr>
-      </w:pPr>
-    </w:p>
-    <w:p>
-      <w:pPr>
-        <w:spacing w:after="0"/>
-        <w:rPr>
-          <w:rFonts w:ascii="Times New Roman" w:hAnsi="Times New Roman" w:cs="Times New Roman"/>
-          <w:sz w:val="22"/>
-          <w:szCs w:val="22"/>
-          <w:lang w:val="en-MY"/>
-        </w:rPr>
-      </w:pPr>
-      <w:r>
-        <w:rPr>
-          <w:rFonts w:ascii="Times New Roman" w:hAnsi="Times New Roman" w:cs="Times New Roman"/>
-          <w:sz w:val="22"/>
-          <w:szCs w:val="22"/>
-          <w:lang w:val="en-MY"/>
-        </w:rPr>
-        <w:t xml:space="preserve">    return EDMONDS_KARP(cap, SOURCE, SINK)</w:t>
-      </w:r>
-    </w:p>
-    <w:p>
-      <w:pPr>
-        <w:spacing w:after="0"/>
-        <w:rPr>
-          <w:rFonts w:ascii="Times New Roman" w:hAnsi="Times New Roman" w:cs="Times New Roman"/>
-          <w:sz w:val="22"/>
-          <w:szCs w:val="22"/>
-          <w:lang w:val="en-MY"/>
-        </w:rPr>
-      </w:pPr>
-    </w:p>
-    <w:p>
-      <w:pPr>
-        <w:spacing w:after="0"/>
-        <w:rPr>
-          <w:rFonts w:ascii="Times New Roman" w:hAnsi="Times New Roman" w:cs="Times New Roman"/>
-          <w:sz w:val="22"/>
-          <w:szCs w:val="22"/>
-          <w:lang w:val="en-MY"/>
-        </w:rPr>
-      </w:pPr>
-    </w:p>
-    <w:p>
-      <w:pPr>
-        <w:spacing w:after="0"/>
-        <w:rPr>
-          <w:rFonts w:ascii="Times New Roman" w:hAnsi="Times New Roman" w:cs="Times New Roman"/>
-          <w:sz w:val="22"/>
-          <w:szCs w:val="22"/>
-          <w:lang w:val="en-MY"/>
-        </w:rPr>
-      </w:pPr>
-      <w:r>
-        <w:rPr>
-          <w:rFonts w:ascii="Times New Roman" w:hAnsi="Times New Roman" w:cs="Times New Roman"/>
-          <w:sz w:val="22"/>
-          <w:szCs w:val="22"/>
-          <w:lang w:val="en-MY"/>
-        </w:rPr>
-        <w:t>function ADD_EDGE(u, v, w):</w:t>
-      </w:r>
-    </w:p>
-    <w:p>
-      <w:pPr>
-        <w:spacing w:after="0"/>
-        <w:rPr>
-          <w:rFonts w:ascii="Times New Roman" w:hAnsi="Times New Roman" w:cs="Times New Roman"/>
-          <w:sz w:val="22"/>
-          <w:szCs w:val="22"/>
-          <w:lang w:val="en-MY"/>
-        </w:rPr>
-      </w:pPr>
-      <w:r>
-        <w:rPr>
-          <w:rFonts w:ascii="Times New Roman" w:hAnsi="Times New Roman" w:cs="Times New Roman"/>
-          <w:sz w:val="22"/>
-          <w:szCs w:val="22"/>
-          <w:lang w:val="en-MY"/>
-        </w:rPr>
-        <w:t xml:space="preserve">    cap[u][v] ← cap[u][v] + w                 // duplicate roads are summed</w:t>
-      </w:r>
-    </w:p>
-    <w:p>
-      <w:pPr>
-        <w:spacing w:after="0"/>
-        <w:rPr>
-          <w:rFonts w:ascii="Times New Roman" w:hAnsi="Times New Roman" w:cs="Times New Roman"/>
-          <w:sz w:val="22"/>
-          <w:szCs w:val="22"/>
-          <w:lang w:val="en-MY"/>
-        </w:rPr>
-      </w:pPr>
-    </w:p>
-    <w:p>
-      <w:pPr>
-        <w:spacing w:after="0"/>
-        <w:rPr>
-          <w:rFonts w:ascii="Times New Roman" w:hAnsi="Times New Roman" w:cs="Times New Roman"/>
-          <w:sz w:val="22"/>
-          <w:szCs w:val="22"/>
-          <w:lang w:val="en-MY"/>
-        </w:rPr>
-      </w:pPr>
-    </w:p>
-    <w:p>
-      <w:pPr>
-        <w:spacing w:after="0"/>
-        <w:rPr>
-          <w:rFonts w:ascii="Times New Roman" w:hAnsi="Times New Roman" w:cs="Times New Roman"/>
-          <w:sz w:val="22"/>
-          <w:szCs w:val="22"/>
-          <w:lang w:val="en-MY"/>
-        </w:rPr>
-      </w:pPr>
-      <w:r>
-        <w:rPr>
-          <w:rFonts w:ascii="Times New Roman" w:hAnsi="Times New Roman" w:cs="Times New Roman"/>
-          <w:sz w:val="22"/>
-          <w:szCs w:val="22"/>
-          <w:lang w:val="en-MY"/>
-        </w:rPr>
-        <w:t>function EDMONDS_KARP(cap, s, t):</w:t>
-      </w:r>
-    </w:p>
-    <w:p>
-      <w:pPr>
-        <w:spacing w:after="0"/>
-        <w:rPr>
-          <w:rFonts w:ascii="Times New Roman" w:hAnsi="Times New Roman" w:cs="Times New Roman"/>
-          <w:sz w:val="22"/>
-          <w:szCs w:val="22"/>
-          <w:lang w:val="en-MY"/>
-        </w:rPr>
-      </w:pPr>
-      <w:r>
-        <w:rPr>
-          <w:rFonts w:ascii="Times New Roman" w:hAnsi="Times New Roman" w:cs="Times New Roman"/>
-          <w:sz w:val="22"/>
-          <w:szCs w:val="22"/>
-          <w:lang w:val="en-MY"/>
-        </w:rPr>
-        <w:t xml:space="preserve">    for each edge (u, v) in cap:              // create reverse edges</w:t>
-      </w:r>
-    </w:p>
-    <w:p>
-      <w:pPr>
-        <w:spacing w:after="0"/>
-        <w:rPr>
-          <w:rFonts w:ascii="Times New Roman" w:hAnsi="Times New Roman" w:cs="Times New Roman"/>
-          <w:sz w:val="22"/>
-          <w:szCs w:val="22"/>
-          <w:lang w:val="en-MY"/>
-        </w:rPr>
-      </w:pPr>
-      <w:r>
-        <w:rPr>
-          <w:rFonts w:ascii="Times New Roman" w:hAnsi="Times New Roman" w:cs="Times New Roman"/>
-          <w:sz w:val="22"/>
-          <w:szCs w:val="22"/>
-          <w:lang w:val="en-MY"/>
-        </w:rPr>
-        <w:t xml:space="preserve">        if (v, u) not in cap:</w:t>
-      </w:r>
-    </w:p>
-    <w:p>
-      <w:pPr>
-        <w:spacing w:after="0"/>
-        <w:rPr>
-          <w:rFonts w:ascii="Times New Roman" w:hAnsi="Times New Roman" w:cs="Times New Roman"/>
-          <w:sz w:val="22"/>
-          <w:szCs w:val="22"/>
-          <w:lang w:val="en-MY"/>
-        </w:rPr>
-      </w:pPr>
-      <w:r>
-        <w:rPr>
-          <w:rFonts w:ascii="Times New Roman" w:hAnsi="Times New Roman" w:cs="Times New Roman"/>
-          <w:sz w:val="22"/>
-          <w:szCs w:val="22"/>
-          <w:lang w:val="en-MY"/>
-        </w:rPr>
-        <w:t xml:space="preserve">            cap[v][u] ← 0</w:t>
-      </w:r>
-    </w:p>
-    <w:p>
-      <w:pPr>
-        <w:spacing w:after="0"/>
-        <w:rPr>
-          <w:rFonts w:ascii="Times New Roman" w:hAnsi="Times New Roman" w:cs="Times New Roman"/>
-          <w:sz w:val="22"/>
-          <w:szCs w:val="22"/>
-          <w:lang w:val="en-MY"/>
-        </w:rPr>
-      </w:pPr>
-      <w:r>
-        <w:rPr>
-          <w:rFonts w:ascii="Times New Roman" w:hAnsi="Times New Roman" w:cs="Times New Roman"/>
-          <w:sz w:val="22"/>
-          <w:szCs w:val="22"/>
-          <w:lang w:val="en-MY"/>
-        </w:rPr>
-        <w:t xml:space="preserve">    flow[u][v] ← 0 for every edge (u, v)</w:t>
-      </w:r>
-    </w:p>
-    <w:p>
-      <w:pPr>
-        <w:spacing w:after="0"/>
-        <w:rPr>
-          <w:rFonts w:ascii="Times New Roman" w:hAnsi="Times New Roman" w:cs="Times New Roman"/>
-          <w:sz w:val="22"/>
-          <w:szCs w:val="22"/>
-          <w:lang w:val="en-MY"/>
-        </w:rPr>
-      </w:pPr>
-      <w:r>
-        <w:rPr>
-          <w:rFonts w:ascii="Times New Roman" w:hAnsi="Times New Roman" w:cs="Times New Roman"/>
-          <w:sz w:val="22"/>
-          <w:szCs w:val="22"/>
-          <w:lang w:val="en-MY"/>
-        </w:rPr>
-        <w:t xml:space="preserve">    total ← 0</w:t>
-      </w:r>
-    </w:p>
-    <w:p>
-      <w:pPr>
-        <w:spacing w:after="0"/>
-        <w:rPr>
-          <w:rFonts w:ascii="Times New Roman" w:hAnsi="Times New Roman" w:cs="Times New Roman"/>
-          <w:sz w:val="22"/>
-          <w:szCs w:val="22"/>
-          <w:lang w:val="en-MY"/>
-        </w:rPr>
-      </w:pPr>
-    </w:p>
-    <w:p>
-      <w:pPr>
-        <w:spacing w:after="0"/>
-        <w:rPr>
-          <w:rFonts w:ascii="Times New Roman" w:hAnsi="Times New Roman" w:cs="Times New Roman"/>
-          <w:sz w:val="22"/>
-          <w:szCs w:val="22"/>
-          <w:lang w:val="en-MY"/>
-        </w:rPr>
-      </w:pPr>
-      <w:r>
-        <w:rPr>
-          <w:rFonts w:ascii="Times New Roman" w:hAnsi="Times New Roman" w:cs="Times New Roman"/>
-          <w:sz w:val="22"/>
-          <w:szCs w:val="22"/>
-          <w:lang w:val="en-MY"/>
-        </w:rPr>
-        <w:t xml:space="preserve">    loop:</w:t>
-      </w:r>
-    </w:p>
-    <w:p>
-      <w:pPr>
-        <w:spacing w:after="0"/>
-        <w:rPr>
-          <w:rFonts w:ascii="Times New Roman" w:hAnsi="Times New Roman" w:cs="Times New Roman"/>
-          <w:sz w:val="22"/>
-          <w:szCs w:val="22"/>
-          <w:lang w:val="en-MY"/>
-        </w:rPr>
-      </w:pPr>
-      <w:r>
-        <w:rPr>
-          <w:rFonts w:ascii="Times New Roman" w:hAnsi="Times New Roman" w:cs="Times New Roman"/>
-          <w:sz w:val="22"/>
-          <w:szCs w:val="22"/>
-          <w:lang w:val="en-MY"/>
-        </w:rPr>
-        <w:t xml:space="preserve">        path ← BFS_PATH(cap, flow, s, t)</w:t>
-      </w:r>
-    </w:p>
-    <w:p>
-      <w:pPr>
-        <w:spacing w:after="0"/>
-        <w:rPr>
-          <w:rFonts w:ascii="Times New Roman" w:hAnsi="Times New Roman" w:cs="Times New Roman"/>
-          <w:sz w:val="22"/>
-          <w:szCs w:val="22"/>
-          <w:lang w:val="en-MY"/>
-        </w:rPr>
-      </w:pPr>
-      <w:r>
-        <w:rPr>
-          <w:rFonts w:ascii="Times New Roman" w:hAnsi="Times New Roman" w:cs="Times New Roman"/>
-          <w:sz w:val="22"/>
-          <w:szCs w:val="22"/>
-          <w:lang w:val="en-MY"/>
-        </w:rPr>
-        <w:t xml:space="preserve">        if path = NONE:</w:t>
-      </w:r>
-    </w:p>
-    <w:p>
-      <w:pPr>
-        <w:spacing w:after="0"/>
-        <w:rPr>
-          <w:rFonts w:ascii="Times New Roman" w:hAnsi="Times New Roman" w:cs="Times New Roman"/>
-          <w:sz w:val="22"/>
-          <w:szCs w:val="22"/>
-          <w:lang w:val="en-MY"/>
-        </w:rPr>
-      </w:pPr>
-      <w:r>
-        <w:rPr>
-          <w:rFonts w:ascii="Times New Roman" w:hAnsi="Times New Roman" w:cs="Times New Roman"/>
-          <w:sz w:val="22"/>
-          <w:szCs w:val="22"/>
-          <w:lang w:val="en-MY"/>
-        </w:rPr>
-        <w:t xml:space="preserve">            return total                      // no augmenting path: flow is maximal</w:t>
-      </w:r>
-    </w:p>
-    <w:p>
-      <w:pPr>
-        <w:spacing w:after="0"/>
-        <w:rPr>
-          <w:rFonts w:ascii="Times New Roman" w:hAnsi="Times New Roman" w:cs="Times New Roman"/>
-          <w:sz w:val="22"/>
-          <w:szCs w:val="22"/>
-          <w:lang w:val="en-MY"/>
-        </w:rPr>
-      </w:pPr>
-      <w:r>
-        <w:rPr>
-          <w:rFonts w:ascii="Times New Roman" w:hAnsi="Times New Roman" w:cs="Times New Roman"/>
-          <w:sz w:val="22"/>
-          <w:szCs w:val="22"/>
-          <w:lang w:val="en-MY"/>
-        </w:rPr>
-        <w:t xml:space="preserve">        total ← total + AUGMENT(cap, flow, path)</w:t>
-      </w:r>
-    </w:p>
-    <w:p>
-      <w:pPr>
-        <w:spacing w:after="0"/>
-        <w:rPr>
-          <w:rFonts w:ascii="Times New Roman" w:hAnsi="Times New Roman" w:cs="Times New Roman"/>
-          <w:sz w:val="22"/>
-          <w:szCs w:val="22"/>
-          <w:lang w:val="en-MY"/>
-        </w:rPr>
-      </w:pPr>
-    </w:p>
-    <w:p>
-      <w:pPr>
-        <w:spacing w:after="0"/>
-        <w:rPr>
-          <w:rFonts w:ascii="Times New Roman" w:hAnsi="Times New Roman" w:cs="Times New Roman"/>
-          <w:sz w:val="22"/>
-          <w:szCs w:val="22"/>
-          <w:lang w:val="en-MY"/>
-        </w:rPr>
-      </w:pPr>
-    </w:p>
-    <w:p>
-      <w:pPr>
-        <w:spacing w:after="0"/>
-        <w:rPr>
-          <w:rFonts w:ascii="Times New Roman" w:hAnsi="Times New Roman" w:cs="Times New Roman"/>
-          <w:sz w:val="22"/>
-          <w:szCs w:val="22"/>
-          <w:lang w:val="en-MY"/>
-        </w:rPr>
-      </w:pPr>
-      <w:r>
-        <w:rPr>
-          <w:rFonts w:ascii="Times New Roman" w:hAnsi="Times New Roman" w:cs="Times New Roman"/>
-          <w:sz w:val="22"/>
-          <w:szCs w:val="22"/>
-          <w:lang w:val="en-MY"/>
-        </w:rPr>
-        <w:t>function BFS_PATH(cap, flow, s, t):</w:t>
-      </w:r>
-    </w:p>
-    <w:p>
-      <w:pPr>
-        <w:spacing w:after="0"/>
-        <w:rPr>
-          <w:rFonts w:ascii="Times New Roman" w:hAnsi="Times New Roman" w:cs="Times New Roman"/>
-          <w:sz w:val="22"/>
-          <w:szCs w:val="22"/>
-          <w:lang w:val="en-MY"/>
-        </w:rPr>
-      </w:pPr>
-      <w:r>
-        <w:rPr>
-          <w:rFonts w:ascii="Times New Roman" w:hAnsi="Times New Roman" w:cs="Times New Roman"/>
-          <w:sz w:val="22"/>
-          <w:szCs w:val="22"/>
-          <w:lang w:val="en-MY"/>
-        </w:rPr>
-        <w:t xml:space="preserve">    parent[s] ← s</w:t>
-      </w:r>
-    </w:p>
-    <w:p>
-      <w:pPr>
-        <w:spacing w:after="0"/>
-        <w:rPr>
-          <w:rFonts w:ascii="Times New Roman" w:hAnsi="Times New Roman" w:cs="Times New Roman"/>
-          <w:sz w:val="22"/>
-          <w:szCs w:val="22"/>
-          <w:lang w:val="en-MY"/>
-        </w:rPr>
-      </w:pPr>
-      <w:r>
-        <w:rPr>
-          <w:rFonts w:ascii="Times New Roman" w:hAnsi="Times New Roman" w:cs="Times New Roman"/>
-          <w:sz w:val="22"/>
-          <w:szCs w:val="22"/>
-          <w:lang w:val="en-MY"/>
-        </w:rPr>
-        <w:lastRenderedPageBreak/>
-        <w:t xml:space="preserve">    queue ← [s]</w:t>
-      </w:r>
-    </w:p>
-    <w:p>
-      <w:pPr>
-        <w:spacing w:after="0"/>
-        <w:rPr>
-          <w:rFonts w:ascii="Times New Roman" w:hAnsi="Times New Roman" w:cs="Times New Roman"/>
-          <w:sz w:val="22"/>
-          <w:szCs w:val="22"/>
-          <w:lang w:val="en-MY"/>
-        </w:rPr>
-      </w:pPr>
-      <w:r>
-        <w:rPr>
-          <w:rFonts w:ascii="Times New Roman" w:hAnsi="Times New Roman" w:cs="Times New Roman"/>
-          <w:sz w:val="22"/>
-          <w:szCs w:val="22"/>
-          <w:lang w:val="en-MY"/>
-        </w:rPr>
-        <w:t xml:space="preserve">    while queue is not empty:</w:t>
-      </w:r>
-    </w:p>
-    <w:p>
-      <w:pPr>
-        <w:spacing w:after="0"/>
-        <w:rPr>
-          <w:rFonts w:ascii="Times New Roman" w:hAnsi="Times New Roman" w:cs="Times New Roman"/>
-          <w:sz w:val="22"/>
-          <w:szCs w:val="22"/>
-          <w:lang w:val="en-MY"/>
-        </w:rPr>
-      </w:pPr>
-      <w:r>
-        <w:rPr>
-          <w:rFonts w:ascii="Times New Roman" w:hAnsi="Times New Roman" w:cs="Times New Roman"/>
-          <w:sz w:val="22"/>
-          <w:szCs w:val="22"/>
-          <w:lang w:val="en-MY"/>
-        </w:rPr>
-        <w:t xml:space="preserve">        u ← dequeue(queue)</w:t>
-      </w:r>
-    </w:p>
-    <w:p>
-      <w:pPr>
-        <w:spacing w:after="0"/>
-        <w:rPr>
-          <w:rFonts w:ascii="Times New Roman" w:hAnsi="Times New Roman" w:cs="Times New Roman"/>
-          <w:sz w:val="22"/>
-          <w:szCs w:val="22"/>
-          <w:lang w:val="en-MY"/>
-        </w:rPr>
-      </w:pPr>
-      <w:r>
-        <w:rPr>
-          <w:rFonts w:ascii="Times New Roman" w:hAnsi="Times New Roman" w:cs="Times New Roman"/>
-          <w:sz w:val="22"/>
-          <w:szCs w:val="22"/>
-          <w:lang w:val="en-MY"/>
-        </w:rPr>
-        <w:t xml:space="preserve">        for each neighbour v of u:</w:t>
-      </w:r>
-    </w:p>
-    <w:p>
-      <w:pPr>
-        <w:spacing w:after="0"/>
-        <w:rPr>
-          <w:rFonts w:ascii="Times New Roman" w:hAnsi="Times New Roman" w:cs="Times New Roman"/>
-          <w:sz w:val="22"/>
-          <w:szCs w:val="22"/>
-          <w:lang w:val="en-MY"/>
-        </w:rPr>
-      </w:pPr>
-      <w:r>
-        <w:rPr>
-          <w:rFonts w:ascii="Times New Roman" w:hAnsi="Times New Roman" w:cs="Times New Roman"/>
-          <w:sz w:val="22"/>
-          <w:szCs w:val="22"/>
-          <w:lang w:val="en-MY"/>
-        </w:rPr>
-        <w:t xml:space="preserve">            if v has no parent and flow[u][v] &lt; cap[u][v]:   // edge has spare capacity</w:t>
-      </w:r>
-    </w:p>
-    <w:p>
-      <w:pPr>
-        <w:spacing w:after="0"/>
-        <w:rPr>
-          <w:rFonts w:ascii="Times New Roman" w:hAnsi="Times New Roman" w:cs="Times New Roman"/>
-          <w:sz w:val="22"/>
-          <w:szCs w:val="22"/>
-          <w:lang w:val="en-MY"/>
-        </w:rPr>
-      </w:pPr>
-      <w:r>
-        <w:rPr>
-          <w:rFonts w:ascii="Times New Roman" w:hAnsi="Times New Roman" w:cs="Times New Roman"/>
-          <w:sz w:val="22"/>
-          <w:szCs w:val="22"/>
-          <w:lang w:val="en-MY"/>
-        </w:rPr>
-        <w:t xml:space="preserve">                parent[v] ← u</w:t>
-      </w:r>
-    </w:p>
-    <w:p>
-      <w:pPr>
-        <w:spacing w:after="0"/>
-        <w:rPr>
-          <w:rFonts w:ascii="Times New Roman" w:hAnsi="Times New Roman" w:cs="Times New Roman"/>
-          <w:sz w:val="22"/>
-          <w:szCs w:val="22"/>
-          <w:lang w:val="en-MY"/>
-        </w:rPr>
-      </w:pPr>
-      <w:r>
-        <w:rPr>
-          <w:rFonts w:ascii="Times New Roman" w:hAnsi="Times New Roman" w:cs="Times New Roman"/>
-          <w:sz w:val="22"/>
-          <w:szCs w:val="22"/>
-          <w:lang w:val="en-MY"/>
-        </w:rPr>
-        <w:t xml:space="preserve">                enqueue(queue, v)</w:t>
-      </w:r>
-    </w:p>
-    <w:p>
-      <w:pPr>
-        <w:spacing w:after="0"/>
-        <w:rPr>
-          <w:rFonts w:ascii="Times New Roman" w:hAnsi="Times New Roman" w:cs="Times New Roman"/>
-          <w:sz w:val="22"/>
-          <w:szCs w:val="22"/>
-          <w:lang w:val="en-MY"/>
-        </w:rPr>
-      </w:pPr>
-      <w:r>
-        <w:rPr>
-          <w:rFonts w:ascii="Times New Roman" w:hAnsi="Times New Roman" w:cs="Times New Roman"/>
-          <w:sz w:val="22"/>
-          <w:szCs w:val="22"/>
-          <w:lang w:val="en-MY"/>
-        </w:rPr>
-        <w:t xml:space="preserve">    if </w:t>
-      </w:r>
-      <w:proofErr w:type="spellStart"/>
-      <w:r>
-        <w:rPr>
-          <w:rFonts w:ascii="Times New Roman" w:hAnsi="Times New Roman" w:cs="Times New Roman"/>
-          <w:sz w:val="22"/>
-          <w:szCs w:val="22"/>
-          <w:lang w:val="en-MY"/>
-        </w:rPr>
-        <w:t>t</w:t>
-      </w:r>
-      <w:proofErr w:type="spellEnd"/>
-      <w:r>
-        <w:rPr>
-          <w:rFonts w:ascii="Times New Roman" w:hAnsi="Times New Roman" w:cs="Times New Roman"/>
-          <w:sz w:val="22"/>
-          <w:szCs w:val="22"/>
-          <w:lang w:val="en-MY"/>
-        </w:rPr>
-        <w:t xml:space="preserve"> has no parent:</w:t>
-      </w:r>
-    </w:p>
-    <w:p>
-      <w:pPr>
-        <w:spacing w:after="0"/>
-        <w:rPr>
-          <w:rFonts w:ascii="Times New Roman" w:hAnsi="Times New Roman" w:cs="Times New Roman"/>
-          <w:sz w:val="22"/>
-          <w:szCs w:val="22"/>
-          <w:lang w:val="en-MY"/>
-        </w:rPr>
-      </w:pPr>
-      <w:r>
-        <w:rPr>
-          <w:rFonts w:ascii="Times New Roman" w:hAnsi="Times New Roman" w:cs="Times New Roman"/>
-          <w:sz w:val="22"/>
-          <w:szCs w:val="22"/>
-          <w:lang w:val="en-MY"/>
-        </w:rPr>
-        <w:t xml:space="preserve">        return NONE</w:t>
-      </w:r>
-    </w:p>
-    <w:p>
-      <w:pPr>
-        <w:spacing w:after="0"/>
-        <w:rPr>
-          <w:rFonts w:ascii="Times New Roman" w:hAnsi="Times New Roman" w:cs="Times New Roman"/>
-          <w:sz w:val="22"/>
-          <w:szCs w:val="22"/>
-          <w:lang w:val="en-MY"/>
-        </w:rPr>
-      </w:pPr>
-      <w:r>
-        <w:rPr>
-          <w:rFonts w:ascii="Times New Roman" w:hAnsi="Times New Roman" w:cs="Times New Roman"/>
-          <w:sz w:val="22"/>
-          <w:szCs w:val="22"/>
-          <w:lang w:val="en-MY"/>
-        </w:rPr>
-        <w:t xml:space="preserve">    return path from s to t, rebuilt by following parent links back from t</w:t>
-      </w:r>
-    </w:p>
-    <w:p>
-      <w:pPr>
-        <w:spacing w:after="0"/>
-        <w:rPr>
-          <w:rFonts w:ascii="Times New Roman" w:hAnsi="Times New Roman" w:cs="Times New Roman"/>
-          <w:sz w:val="22"/>
-          <w:szCs w:val="22"/>
-          <w:lang w:val="en-MY"/>
-        </w:rPr>
-      </w:pPr>
-    </w:p>
-    <w:p>
-      <w:pPr>
-        <w:spacing w:after="0"/>
-        <w:rPr>
-          <w:rFonts w:ascii="Times New Roman" w:hAnsi="Times New Roman" w:cs="Times New Roman"/>
-          <w:sz w:val="22"/>
-          <w:szCs w:val="22"/>
-          <w:lang w:val="en-MY"/>
-        </w:rPr>
-      </w:pPr>
-    </w:p>
-    <w:p>
-      <w:pPr>
-        <w:spacing w:after="0"/>
-        <w:rPr>
-          <w:rFonts w:ascii="Times New Roman" w:hAnsi="Times New Roman" w:cs="Times New Roman"/>
-          <w:sz w:val="22"/>
-          <w:szCs w:val="22"/>
-          <w:lang w:val="en-MY"/>
-        </w:rPr>
-      </w:pPr>
-      <w:r>
-        <w:rPr>
-          <w:rFonts w:ascii="Times New Roman" w:hAnsi="Times New Roman" w:cs="Times New Roman"/>
-          <w:sz w:val="22"/>
-          <w:szCs w:val="22"/>
-          <w:lang w:val="en-MY"/>
-        </w:rPr>
-        <w:t>function AUGMENT(cap, flow, path):</w:t>
-      </w:r>
-    </w:p>
-    <w:p>
-      <w:pPr>
-        <w:spacing w:after="0"/>
-        <w:rPr>
-          <w:rFonts w:ascii="Times New Roman" w:hAnsi="Times New Roman" w:cs="Times New Roman"/>
-          <w:sz w:val="22"/>
-          <w:szCs w:val="22"/>
-          <w:lang w:val="en-MY"/>
-        </w:rPr>
-      </w:pPr>
-      <w:r>
-        <w:rPr>
-          <w:rFonts w:ascii="Times New Roman" w:hAnsi="Times New Roman" w:cs="Times New Roman"/>
-          <w:sz w:val="22"/>
-          <w:szCs w:val="22"/>
-          <w:lang w:val="en-MY"/>
-        </w:rPr>
-        <w:t xml:space="preserve">    bottleneck ← min over edges (u, v) in path of (cap[u][v] − flow[u][v])</w:t>
-      </w:r>
-    </w:p>
-    <w:p>
-      <w:pPr>
-        <w:spacing w:after="0"/>
-        <w:rPr>
-          <w:rFonts w:ascii="Times New Roman" w:hAnsi="Times New Roman" w:cs="Times New Roman"/>
-          <w:sz w:val="22"/>
-          <w:szCs w:val="22"/>
-          <w:lang w:val="en-MY"/>
-        </w:rPr>
-      </w:pPr>
-      <w:r>
-        <w:rPr>
-          <w:rFonts w:ascii="Times New Roman" w:hAnsi="Times New Roman" w:cs="Times New Roman"/>
-          <w:sz w:val="22"/>
-          <w:szCs w:val="22"/>
-          <w:lang w:val="en-MY"/>
-        </w:rPr>
-        <w:t xml:space="preserve">    for each edge (u, v) in path:</w:t>
-      </w:r>
-    </w:p>
-    <w:p>
-      <w:pPr>
-        <w:spacing w:after="0"/>
-        <w:rPr>
-          <w:rFonts w:ascii="Times New Roman" w:hAnsi="Times New Roman" w:cs="Times New Roman"/>
-          <w:sz w:val="22"/>
-          <w:szCs w:val="22"/>
-          <w:lang w:val="en-MY"/>
-        </w:rPr>
-      </w:pPr>
-      <w:r>
-        <w:rPr>
-          <w:rFonts w:ascii="Times New Roman" w:hAnsi="Times New Roman" w:cs="Times New Roman"/>
-          <w:sz w:val="22"/>
-          <w:szCs w:val="22"/>
-          <w:lang w:val="en-MY"/>
-        </w:rPr>
-        <w:t xml:space="preserve">        flow[u][v] ← flow[u][v] + bottleneck</w:t>
-      </w:r>
-    </w:p>
-    <w:p>
-      <w:pPr>
-        <w:spacing w:after="0"/>
-        <w:rPr>
-          <w:rFonts w:ascii="Times New Roman" w:hAnsi="Times New Roman" w:cs="Times New Roman"/>
-          <w:sz w:val="22"/>
-          <w:szCs w:val="22"/>
-          <w:lang w:val="en-MY"/>
-        </w:rPr>
-      </w:pPr>
-      <w:r>
-        <w:rPr>
-          <w:rFonts w:ascii="Times New Roman" w:hAnsi="Times New Roman" w:cs="Times New Roman"/>
-          <w:sz w:val="22"/>
-          <w:szCs w:val="22"/>
-          <w:lang w:val="en-MY"/>
-        </w:rPr>
-        <w:t xml:space="preserve">        flow[v][u] ← flow[v][u] − bottleneck  // allows this flow to be undone later</w:t>
-      </w:r>
-    </w:p>
-    <w:p>
-      <w:pPr>
-        <w:spacing w:after="0"/>
-        <w:rPr>
-          <w:rFonts w:ascii="Times New Roman" w:hAnsi="Times New Roman" w:cs="Times New Roman"/>
-          <w:sz w:val="22"/>
-          <w:szCs w:val="22"/>
-          <w:lang w:val="en-MY"/>
-        </w:rPr>
-      </w:pPr>
-      <w:r>
-        <w:rPr>
-          <w:rFonts w:ascii="Times New Roman" w:hAnsi="Times New Roman" w:cs="Times New Roman"/>
-          <w:sz w:val="22"/>
-          <w:szCs w:val="22"/>
-          <w:lang w:val="en-MY"/>
-        </w:rPr>
-        <w:t xml:space="preserve">    return bottleneck</w:t>
-      </w:r>
-    </w:p>
-    <w:p>
-      <w:pPr>
-        <w:spacing w:after="0"/>
-        <w:rPr>
-          <w:rFonts w:ascii="Times New Roman" w:hAnsi="Times New Roman" w:cs="Times New Roman"/>
-          <w:sz w:val="22"/>
-          <w:szCs w:val="22"/>
-          <w:lang w:val="en-MY"/>
-        </w:rPr>
-      </w:pPr>
-    </w:p>
-    <w:p>
-      <w:pPr>
-        <w:spacing w:after="0"/>
-        <w:rPr>
-          <w:rFonts w:ascii="Times New Roman" w:hAnsi="Times New Roman" w:cs="Times New Roman"/>
-          <w:sz w:val="22"/>
-          <w:szCs w:val="22"/>
-          <w:lang w:val="en-MY"/>
-        </w:rPr>
-      </w:pPr>
-    </w:p>
-    <w:p>
-      <w:pPr>
-        <w:spacing w:after="0"/>
-        <w:rPr>
-          <w:rFonts w:ascii="Times New Roman" w:hAnsi="Times New Roman" w:cs="Times New Roman"/>
-          <w:sz w:val="22"/>
-          <w:szCs w:val="22"/>
-          <w:lang w:val="en-MY"/>
-        </w:rPr>
-      </w:pPr>
-      <w:r>
-        <w:rPr>
-          <w:rFonts w:ascii="Times New Roman" w:hAnsi="Times New Roman" w:cs="Times New Roman"/>
-          <w:sz w:val="22"/>
-          <w:szCs w:val="22"/>
-          <w:lang w:val="en-MY"/>
-        </w:rPr>
-        <w:t>main:</w:t>
-      </w:r>
-    </w:p>
-    <w:p>
-      <w:pPr>
-        <w:spacing w:after="0"/>
-        <w:rPr>
-          <w:rFonts w:ascii="Times New Roman" w:hAnsi="Times New Roman" w:cs="Times New Roman"/>
-          <w:sz w:val="22"/>
-          <w:szCs w:val="22"/>
-          <w:lang w:val="en-MY"/>
-        </w:rPr>
-      </w:pPr>
-      <w:r>
-        <w:rPr>
-          <w:rFonts w:ascii="Times New Roman" w:hAnsi="Times New Roman" w:cs="Times New Roman"/>
-          <w:sz w:val="22"/>
-          <w:szCs w:val="22"/>
-          <w:lang w:val="en-MY"/>
-        </w:rPr>
-        <w:t xml:space="preserve">    read T, S, R</w:t>
-      </w:r>
-    </w:p>
-    <w:p>
-      <w:pPr>
-        <w:spacing w:after="0"/>
-        <w:rPr>
-          <w:rFonts w:ascii="Times New Roman" w:hAnsi="Times New Roman" w:cs="Times New Roman"/>
-          <w:sz w:val="22"/>
-          <w:szCs w:val="22"/>
-          <w:lang w:val="en-MY"/>
-        </w:rPr>
-      </w:pPr>
-      <w:r>
-        <w:rPr>
-          <w:rFonts w:ascii="Times New Roman" w:hAnsi="Times New Roman" w:cs="Times New Roman"/>
-          <w:sz w:val="22"/>
-          <w:szCs w:val="22"/>
-          <w:lang w:val="en-MY"/>
-        </w:rPr>
-        <w:t xml:space="preserve">    read p[1..T], c[1..S]</w:t>
-      </w:r>
-    </w:p>
-    <w:p>
-      <w:pPr>
-        <w:spacing w:after="0"/>
-        <w:rPr>
-          <w:rFonts w:ascii="Times New Roman" w:hAnsi="Times New Roman" w:cs="Times New Roman"/>
-          <w:sz w:val="22"/>
-          <w:szCs w:val="22"/>
-          <w:lang w:val="en-MY"/>
-        </w:rPr>
-      </w:pPr>
-      <w:r>
-        <w:rPr>
-          <w:rFonts w:ascii="Times New Roman" w:hAnsi="Times New Roman" w:cs="Times New Roman"/>
-          <w:sz w:val="22"/>
-          <w:szCs w:val="22"/>
-          <w:lang w:val="en-MY"/>
-        </w:rPr>
-        <w:t xml:space="preserve">    read R roads (u, v, w)</w:t>
-      </w:r>
-    </w:p>
-    <w:p>
-      <w:pPr>
-        <w:spacing w:after="0"/>
-        <w:rPr>
-          <w:rFonts w:ascii="Times New Roman" w:hAnsi="Times New Roman" w:cs="Times New Roman"/>
-          <w:sz w:val="22"/>
-          <w:szCs w:val="22"/>
-          <w:lang w:val="en-MY"/>
-        </w:rPr>
-      </w:pPr>
-      <w:r>
-        <w:rPr>
-          <w:rFonts w:ascii="Times New Roman" w:hAnsi="Times New Roman" w:cs="Times New Roman"/>
-          <w:sz w:val="22"/>
-          <w:szCs w:val="22"/>
-          <w:lang w:val="en-MY"/>
-        </w:rPr>
-        <w:t xml:space="preserve">    print MAX_EVACUATED(T, S, p, c, roads)</w:t>
+        <w:t>build network: super-source → each town (capacity pᵢ),</w:t>
+      </w:r>
+    </w:p>
+    <w:p>
+      <w:pPr>
+        <w:spacing w:after="0"/>
+        <w:rPr>
+          <w:rFonts w:ascii="Times New Roman" w:hAnsi="Times New Roman" w:cs="Times New Roman"/>
+          <w:sz w:val="22"/>
+          <w:szCs w:val="22"/>
+          <w:lang w:val="en-MY"/>
+        </w:rPr>
+      </w:pPr>
+      <w:r>
+        <w:rPr>
+          <w:rFonts w:ascii="Times New Roman" w:hAnsi="Times New Roman" w:cs="Times New Roman"/>
+          <w:sz w:val="22"/>
+          <w:szCs w:val="22"/>
+          <w:lang w:val="en-MY"/>
+        </w:rPr>
+        <w:t xml:space="preserve">               each shelter → super-sink (capacity cⱼ),</w:t>
+      </w:r>
+    </w:p>
+    <w:p>
+      <w:pPr>
+        <w:spacing w:after="0"/>
+        <w:rPr>
+          <w:rFonts w:ascii="Times New Roman" w:hAnsi="Times New Roman" w:cs="Times New Roman"/>
+          <w:sz w:val="22"/>
+          <w:szCs w:val="22"/>
+          <w:lang w:val="en-MY"/>
+        </w:rPr>
+      </w:pPr>
+      <w:r>
+        <w:rPr>
+          <w:rFonts w:ascii="Times New Roman" w:hAnsi="Times New Roman" w:cs="Times New Roman"/>
+          <w:sz w:val="22"/>
+          <w:szCs w:val="22"/>
+          <w:lang w:val="en-MY"/>
+        </w:rPr>
+        <w:t xml:space="preserve">               each road u → v (capacity w)</w:t>
+      </w:r>
+    </w:p>
+    <w:p>
+      <w:pPr>
+        <w:spacing w:after="0"/>
+        <w:rPr>
+          <w:rFonts w:ascii="Times New Roman" w:hAnsi="Times New Roman" w:cs="Times New Roman"/>
+          <w:sz w:val="22"/>
+          <w:szCs w:val="22"/>
+          <w:lang w:val="en-MY"/>
+        </w:rPr>
+      </w:pPr>
+      <w:r>
+        <w:rPr>
+          <w:rFonts w:ascii="Times New Roman" w:hAnsi="Times New Roman" w:cs="Times New Roman"/>
+          <w:sz w:val="22"/>
+          <w:szCs w:val="22"/>
+          <w:lang w:val="en-MY"/>
+        </w:rPr>
+        <w:t>total ← 0</w:t>
+      </w:r>
+    </w:p>
+    <w:p>
+      <w:pPr>
+        <w:spacing w:after="0"/>
+        <w:rPr>
+          <w:rFonts w:ascii="Times New Roman" w:hAnsi="Times New Roman" w:cs="Times New Roman"/>
+          <w:sz w:val="22"/>
+          <w:szCs w:val="22"/>
+          <w:lang w:val="en-MY"/>
+        </w:rPr>
+      </w:pPr>
+      <w:r>
+        <w:rPr>
+          <w:rFonts w:ascii="Times New Roman" w:hAnsi="Times New Roman" w:cs="Times New Roman"/>
+          <w:sz w:val="22"/>
+          <w:szCs w:val="22"/>
+          <w:lang w:val="en-MY"/>
+        </w:rPr>
+        <w:t>while BFS finds a path from super-source to super-sink with spare capacity:</w:t>
+      </w:r>
+    </w:p>
+    <w:p>
+      <w:pPr>
+        <w:spacing w:after="0"/>
+        <w:rPr>
+          <w:rFonts w:ascii="Times New Roman" w:hAnsi="Times New Roman" w:cs="Times New Roman"/>
+          <w:sz w:val="22"/>
+          <w:szCs w:val="22"/>
+          <w:lang w:val="en-MY"/>
+        </w:rPr>
+      </w:pPr>
+      <w:r>
+        <w:rPr>
+          <w:rFonts w:ascii="Times New Roman" w:hAnsi="Times New Roman" w:cs="Times New Roman"/>
+          <w:sz w:val="22"/>
+          <w:szCs w:val="22"/>
+          <w:lang w:val="en-MY"/>
+        </w:rPr>
+        <w:t xml:space="preserve">    b ← smallest spare capacity on that path</w:t>
+      </w:r>
+    </w:p>
+    <w:p>
+      <w:pPr>
+        <w:spacing w:after="0"/>
+        <w:rPr>
+          <w:rFonts w:ascii="Times New Roman" w:hAnsi="Times New Roman" w:cs="Times New Roman"/>
+          <w:sz w:val="22"/>
+          <w:szCs w:val="22"/>
+          <w:lang w:val="en-MY"/>
+        </w:rPr>
+      </w:pPr>
+      <w:r>
+        <w:rPr>
+          <w:rFonts w:ascii="Times New Roman" w:hAnsi="Times New Roman" w:cs="Times New Roman"/>
+          <w:sz w:val="22"/>
+          <w:szCs w:val="22"/>
+          <w:lang w:val="en-MY"/>
+        </w:rPr>
+        <w:t xml:space="preserve">    push b along the path; add b to each reverse edge</w:t>
+      </w:r>
+    </w:p>
+    <w:p>
+      <w:pPr>
+        <w:spacing w:after="0"/>
+        <w:rPr>
+          <w:rFonts w:ascii="Times New Roman" w:hAnsi="Times New Roman" w:cs="Times New Roman"/>
+          <w:sz w:val="22"/>
+          <w:szCs w:val="22"/>
+          <w:lang w:val="en-MY"/>
+        </w:rPr>
+      </w:pPr>
+      <w:r>
+        <w:rPr>
+          <w:rFonts w:ascii="Times New Roman" w:hAnsi="Times New Roman" w:cs="Times New Roman"/>
+          <w:sz w:val="22"/>
+          <w:szCs w:val="22"/>
+          <w:lang w:val="en-MY"/>
+        </w:rPr>
+        <w:t xml:space="preserve">    total ← total + b</w:t>
+      </w:r>
+    </w:p>
+    <w:p>
+      <w:pPr>
+        <w:spacing w:after="0"/>
+        <w:rPr>
+          <w:rFonts w:ascii="Times New Roman" w:hAnsi="Times New Roman" w:cs="Times New Roman"/>
+          <w:sz w:val="22"/>
+          <w:szCs w:val="22"/>
+          <w:lang w:val="en-MY"/>
+        </w:rPr>
+      </w:pPr>
+      <w:r>
+        <w:rPr>
+          <w:rFonts w:ascii="Times New Roman" w:hAnsi="Times New Roman" w:cs="Times New Roman"/>
+          <w:sz w:val="22"/>
+          <w:szCs w:val="22"/>
+          <w:lang w:val="en-MY"/>
+        </w:rPr>
+        <w:t>return total</w:t>
       </w:r>
     </w:p>
     <w:p>
@@ -2556,17 +1653,7 @@
           <w:szCs w:val="22"/>
           <w:lang w:val="en-MY"/>
         </w:rPr>
-        <w:t xml:space="preserve">Augmenting by one person at a time rather than by the full bottleneck. This approach always produces the correct answer, but requires one iteration per person evacuated. With capacities </w:t>
-      </w:r>
-      <w:r>
-        <w:rPr>
-          <w:rFonts w:ascii="Times New Roman" w:hAnsi="Times New Roman" w:cs="Times New Roman"/>
-          <w:sz w:val="22"/>
-          <w:szCs w:val="22"/>
-          <w:lang w:val="en-MY"/>
-        </w:rPr>
-        <w:lastRenderedPageBreak/>
-        <w:t>up to 10⁹, it performs on the order of 10⁸ to 10⁹ iterations and exceeds the time limit, whereas the bottleneck-based approach requires only a handful of iterations on the same input.</w:t>
+        <w:t>Augmenting by one person at a time rather than by the full bottleneck. This approach always produces the correct answer, but requires one iteration per person evacuated. With capacities up to 10⁹, it performs on the order of 10⁸ to 10⁹ iterations and exceeds the time limit, whereas the bottleneck-based approach requires only a handful of iterations on the same input.</w:t>
       </w:r>
     </w:p>
     <w:p>
@@ -2623,6 +1710,7 @@
           <w:szCs w:val="22"/>
           <w:lang w:val="en-MY"/>
         </w:rPr>
+        <w:lastRenderedPageBreak/>
         <w:t xml:space="preserve">I utilised Generative AI to help refine the Wildfire Evacuation story to verify if the story aligns with the Max-Flow algorithm as the original story were missing some gaps that I overlooked. Additionally, </w:t>
       </w:r>
       <w:r>

</xml_diff>